<commit_message>
Peer Evaluation & Time Log Ovcharenko 20.09.26
</commit_message>
<xml_diff>
--- a/Reports, Logs & Evaluations/Time Logs/Ovcharenko/Time Log.docx
+++ b/Reports, Logs & Evaluations/Time Logs/Ovcharenko/Time Log.docx
@@ -38,11 +38,7 @@
       </w:pPr>
       <w:r>
         <w:rPr/>
-        <w:t xml:space="preserve">Project: </w:t>
-      </w:r>
-      <w:r>
-        <w:rPr/>
-        <w:t>Academic Scheduler</w:t>
+        <w:t>Project: Academic Scheduler</w:t>
       </w:r>
     </w:p>
     <w:p>
@@ -75,8 +71,8 @@
         <w:gridCol w:w="1772"/>
         <w:gridCol w:w="1323"/>
         <w:gridCol w:w="1516"/>
-        <w:gridCol w:w="1634"/>
-        <w:gridCol w:w="1512"/>
+        <w:gridCol w:w="1633"/>
+        <w:gridCol w:w="1513"/>
       </w:tblGrid>
       <w:tr>
         <w:trPr/>
@@ -89,6 +85,7 @@
             <w:pPr>
               <w:pStyle w:val="Normal"/>
               <w:widowControl/>
+              <w:suppressAutoHyphens w:val="true"/>
               <w:spacing w:lineRule="auto" w:line="240" w:before="0" w:after="0"/>
               <w:jc w:val="center"/>
               <w:rPr>
@@ -120,6 +117,7 @@
             <w:pPr>
               <w:pStyle w:val="Normal"/>
               <w:widowControl/>
+              <w:suppressAutoHyphens w:val="true"/>
               <w:spacing w:lineRule="auto" w:line="240" w:before="0" w:after="0"/>
               <w:jc w:val="center"/>
               <w:rPr>
@@ -151,6 +149,7 @@
             <w:pPr>
               <w:pStyle w:val="Normal"/>
               <w:widowControl/>
+              <w:suppressAutoHyphens w:val="true"/>
               <w:spacing w:lineRule="auto" w:line="240" w:before="0" w:after="0"/>
               <w:jc w:val="center"/>
               <w:rPr>
@@ -182,6 +181,7 @@
             <w:pPr>
               <w:pStyle w:val="Normal"/>
               <w:widowControl/>
+              <w:suppressAutoHyphens w:val="true"/>
               <w:spacing w:lineRule="auto" w:line="240" w:before="0" w:after="0"/>
               <w:jc w:val="center"/>
               <w:rPr>
@@ -206,13 +206,14 @@
         </w:tc>
         <w:tc>
           <w:tcPr>
-            <w:tcW w:w="1634" w:type="dxa"/>
-            <w:tcBorders/>
-          </w:tcPr>
-          <w:p>
-            <w:pPr>
-              <w:pStyle w:val="Normal"/>
-              <w:widowControl/>
+            <w:tcW w:w="1633" w:type="dxa"/>
+            <w:tcBorders/>
+          </w:tcPr>
+          <w:p>
+            <w:pPr>
+              <w:pStyle w:val="Normal"/>
+              <w:widowControl/>
+              <w:suppressAutoHyphens w:val="true"/>
               <w:spacing w:lineRule="auto" w:line="240" w:before="0" w:after="0"/>
               <w:jc w:val="center"/>
               <w:rPr>
@@ -237,13 +238,14 @@
         </w:tc>
         <w:tc>
           <w:tcPr>
-            <w:tcW w:w="1512" w:type="dxa"/>
-            <w:tcBorders/>
-          </w:tcPr>
-          <w:p>
-            <w:pPr>
-              <w:pStyle w:val="Normal"/>
-              <w:widowControl/>
+            <w:tcW w:w="1513" w:type="dxa"/>
+            <w:tcBorders/>
+          </w:tcPr>
+          <w:p>
+            <w:pPr>
+              <w:pStyle w:val="Normal"/>
+              <w:widowControl/>
+              <w:suppressAutoHyphens w:val="true"/>
               <w:spacing w:lineRule="auto" w:line="240" w:before="0" w:after="0"/>
               <w:jc w:val="center"/>
               <w:rPr>
@@ -278,6 +280,7 @@
             <w:pPr>
               <w:pStyle w:val="Normal"/>
               <w:widowControl/>
+              <w:suppressAutoHyphens w:val="true"/>
               <w:spacing w:lineRule="auto" w:line="240" w:before="0" w:after="0"/>
               <w:jc w:val="left"/>
               <w:rPr>
@@ -303,65 +306,26 @@
             <w:pPr>
               <w:pStyle w:val="Normal"/>
               <w:widowControl/>
-              <w:spacing w:lineRule="auto" w:line="240" w:before="0" w:after="0"/>
-              <w:jc w:val="left"/>
-              <w:rPr>
-                <w:rFonts w:ascii="Calibri" w:hAnsi="Calibri" w:eastAsia="Calibri" w:cs=""/>
-                <w:kern w:val="0"/>
-                <w:sz w:val="22"/>
-                <w:szCs w:val="22"/>
-                <w:lang w:val="en-US" w:eastAsia="en-US" w:bidi="ar-SA"/>
-              </w:rPr>
-            </w:pPr>
-            <w:r>
-              <w:rPr>
-                <w:rFonts w:eastAsia="Calibri" w:cs=""/>
-                <w:kern w:val="0"/>
-                <w:sz w:val="22"/>
-                <w:szCs w:val="22"/>
-                <w:lang w:val="en-US" w:eastAsia="en-US" w:bidi="ar-SA"/>
-              </w:rPr>
-              <w:t>09/</w:t>
-            </w:r>
-            <w:r>
-              <w:rPr>
-                <w:rFonts w:eastAsia="Calibri" w:cs=""/>
-                <w:kern w:val="0"/>
-                <w:sz w:val="22"/>
-                <w:szCs w:val="22"/>
-                <w:lang w:val="en-US" w:eastAsia="en-US" w:bidi="ar-SA"/>
-              </w:rPr>
-              <w:t>14</w:t>
-            </w:r>
-            <w:r>
-              <w:rPr>
-                <w:rFonts w:eastAsia="Calibri" w:cs=""/>
-                <w:kern w:val="0"/>
-                <w:sz w:val="22"/>
-                <w:szCs w:val="22"/>
-                <w:lang w:val="en-US" w:eastAsia="en-US" w:bidi="ar-SA"/>
-              </w:rPr>
-              <w:t>/26- 09/</w:t>
-            </w:r>
-            <w:r>
-              <w:rPr>
-                <w:rFonts w:eastAsia="Calibri" w:cs=""/>
-                <w:kern w:val="0"/>
-                <w:sz w:val="22"/>
-                <w:szCs w:val="22"/>
-                <w:lang w:val="en-US" w:eastAsia="en-US" w:bidi="ar-SA"/>
-              </w:rPr>
-              <w:t>20</w:t>
-            </w:r>
-            <w:r>
-              <w:rPr>
-                <w:rFonts w:eastAsia="Calibri" w:cs=""/>
-                <w:kern w:val="0"/>
-                <w:sz w:val="22"/>
-                <w:szCs w:val="22"/>
-                <w:lang w:val="en-US" w:eastAsia="en-US" w:bidi="ar-SA"/>
-              </w:rPr>
-              <w:t>/26</w:t>
+              <w:suppressAutoHyphens w:val="true"/>
+              <w:spacing w:lineRule="auto" w:line="240" w:before="0" w:after="0"/>
+              <w:jc w:val="left"/>
+              <w:rPr>
+                <w:rFonts w:ascii="Calibri" w:hAnsi="Calibri" w:eastAsia="Calibri" w:cs=""/>
+                <w:kern w:val="0"/>
+                <w:sz w:val="22"/>
+                <w:szCs w:val="22"/>
+                <w:lang w:val="en-US" w:eastAsia="en-US" w:bidi="ar-SA"/>
+              </w:rPr>
+            </w:pPr>
+            <w:r>
+              <w:rPr>
+                <w:rFonts w:eastAsia="Calibri" w:cs=""/>
+                <w:kern w:val="0"/>
+                <w:sz w:val="22"/>
+                <w:szCs w:val="22"/>
+                <w:lang w:val="en-US" w:eastAsia="en-US" w:bidi="ar-SA"/>
+              </w:rPr>
+              <w:t>09/14/26- 09/20/26</w:t>
             </w:r>
           </w:p>
         </w:tc>
@@ -374,6 +338,7 @@
             <w:pPr>
               <w:pStyle w:val="Normal"/>
               <w:widowControl/>
+              <w:suppressAutoHyphens w:val="true"/>
               <w:spacing w:lineRule="auto" w:line="240" w:before="0" w:after="0"/>
               <w:jc w:val="left"/>
               <w:rPr>
@@ -405,55 +370,26 @@
             <w:pPr>
               <w:pStyle w:val="Normal"/>
               <w:widowControl/>
-              <w:spacing w:lineRule="auto" w:line="240" w:before="0" w:after="0"/>
-              <w:jc w:val="left"/>
-              <w:rPr>
-                <w:rFonts w:ascii="Calibri" w:hAnsi="Calibri" w:eastAsia="Calibri" w:cs=""/>
-                <w:kern w:val="0"/>
-                <w:sz w:val="22"/>
-                <w:szCs w:val="22"/>
-                <w:lang w:val="en-US" w:eastAsia="en-US" w:bidi="ar-SA"/>
-              </w:rPr>
-            </w:pPr>
-            <w:r>
-              <w:rPr>
-                <w:rFonts w:eastAsia="Calibri" w:cs=""/>
-                <w:kern w:val="0"/>
-                <w:sz w:val="22"/>
-                <w:szCs w:val="22"/>
-                <w:lang w:val="en-US" w:eastAsia="en-US" w:bidi="ar-SA"/>
-              </w:rPr>
-              <w:t>09/</w:t>
-            </w:r>
-            <w:r>
-              <w:rPr>
-                <w:rFonts w:eastAsia="Calibri" w:cs=""/>
-                <w:kern w:val="0"/>
-                <w:sz w:val="22"/>
-                <w:szCs w:val="22"/>
-                <w:lang w:val="en-US" w:eastAsia="en-US" w:bidi="ar-SA"/>
-              </w:rPr>
-              <w:t>19</w:t>
-            </w:r>
-            <w:r>
-              <w:rPr>
-                <w:rFonts w:eastAsia="Calibri" w:cs=""/>
-                <w:kern w:val="0"/>
-                <w:sz w:val="22"/>
-                <w:szCs w:val="22"/>
-                <w:lang w:val="en-US" w:eastAsia="en-US" w:bidi="ar-SA"/>
-              </w:rPr>
-              <w:t>/</w:t>
-            </w:r>
-            <w:r>
-              <w:rPr>
-                <w:rFonts w:eastAsia="Calibri" w:cs=""/>
-                <w:kern w:val="0"/>
-                <w:sz w:val="22"/>
-                <w:szCs w:val="22"/>
-                <w:lang w:val="en-US" w:eastAsia="en-US" w:bidi="ar-SA"/>
-              </w:rPr>
-              <w:t>26</w:t>
+              <w:suppressAutoHyphens w:val="true"/>
+              <w:spacing w:lineRule="auto" w:line="240" w:before="0" w:after="0"/>
+              <w:jc w:val="left"/>
+              <w:rPr>
+                <w:rFonts w:ascii="Calibri" w:hAnsi="Calibri" w:eastAsia="Calibri" w:cs=""/>
+                <w:kern w:val="0"/>
+                <w:sz w:val="22"/>
+                <w:szCs w:val="22"/>
+                <w:lang w:val="en-US" w:eastAsia="en-US" w:bidi="ar-SA"/>
+              </w:rPr>
+            </w:pPr>
+            <w:r>
+              <w:rPr>
+                <w:rFonts w:eastAsia="Calibri" w:cs=""/>
+                <w:kern w:val="0"/>
+                <w:sz w:val="22"/>
+                <w:szCs w:val="22"/>
+                <w:lang w:val="en-US" w:eastAsia="en-US" w:bidi="ar-SA"/>
+              </w:rPr>
+              <w:t>09/19/26</w:t>
             </w:r>
           </w:p>
         </w:tc>
@@ -466,157 +402,90 @@
             <w:pPr>
               <w:pStyle w:val="Normal"/>
               <w:widowControl/>
-              <w:spacing w:lineRule="auto" w:line="240" w:before="0" w:after="0"/>
-              <w:jc w:val="left"/>
-              <w:rPr>
-                <w:rFonts w:ascii="Calibri" w:hAnsi="Calibri" w:eastAsia="Calibri" w:cs=""/>
-                <w:kern w:val="0"/>
-                <w:sz w:val="22"/>
-                <w:szCs w:val="22"/>
-                <w:lang w:val="en-US" w:eastAsia="en-US" w:bidi="ar-SA"/>
-              </w:rPr>
-            </w:pPr>
-            <w:r>
-              <w:rPr>
-                <w:rFonts w:eastAsia="Calibri" w:cs=""/>
-                <w:kern w:val="0"/>
-                <w:sz w:val="22"/>
-                <w:szCs w:val="22"/>
-                <w:lang w:val="en-US" w:eastAsia="en-US" w:bidi="ar-SA"/>
-              </w:rPr>
-              <w:t>2:30</w:t>
-            </w:r>
-            <w:r>
-              <w:rPr>
-                <w:rFonts w:eastAsia="Calibri" w:cs=""/>
-                <w:kern w:val="0"/>
-                <w:sz w:val="22"/>
-                <w:szCs w:val="22"/>
-                <w:lang w:val="en-US" w:eastAsia="en-US" w:bidi="ar-SA"/>
-              </w:rPr>
-              <w:t xml:space="preserve"> </w:t>
-            </w:r>
-            <w:r>
-              <w:rPr>
-                <w:rFonts w:eastAsia="Calibri" w:cs=""/>
-                <w:kern w:val="0"/>
-                <w:sz w:val="22"/>
-                <w:szCs w:val="22"/>
-                <w:lang w:val="en-US" w:eastAsia="en-US" w:bidi="ar-SA"/>
-              </w:rPr>
-              <w:t>p</w:t>
-            </w:r>
-            <w:r>
-              <w:rPr>
-                <w:rFonts w:eastAsia="Calibri" w:cs=""/>
-                <w:kern w:val="0"/>
-                <w:sz w:val="22"/>
-                <w:szCs w:val="22"/>
-                <w:lang w:val="en-US" w:eastAsia="en-US" w:bidi="ar-SA"/>
-              </w:rPr>
-              <w:t>m</w:t>
-            </w:r>
-          </w:p>
-        </w:tc>
-        <w:tc>
-          <w:tcPr>
-            <w:tcW w:w="1634" w:type="dxa"/>
-            <w:tcBorders/>
-          </w:tcPr>
-          <w:p>
-            <w:pPr>
-              <w:pStyle w:val="Normal"/>
-              <w:widowControl/>
-              <w:spacing w:lineRule="auto" w:line="240" w:before="0" w:after="0"/>
-              <w:jc w:val="left"/>
-              <w:rPr>
-                <w:rFonts w:ascii="Calibri" w:hAnsi="Calibri" w:eastAsia="Calibri" w:cs=""/>
-                <w:kern w:val="0"/>
-                <w:sz w:val="22"/>
-                <w:szCs w:val="22"/>
-                <w:lang w:val="en-US" w:eastAsia="en-US" w:bidi="ar-SA"/>
-              </w:rPr>
-            </w:pPr>
-            <w:r>
-              <w:rPr>
-                <w:rFonts w:eastAsia="Calibri" w:cs=""/>
-                <w:kern w:val="0"/>
-                <w:sz w:val="22"/>
-                <w:szCs w:val="22"/>
-                <w:lang w:val="en-US" w:eastAsia="en-US" w:bidi="ar-SA"/>
-              </w:rPr>
-              <w:t>2:45</w:t>
-            </w:r>
-            <w:r>
-              <w:rPr>
-                <w:rFonts w:eastAsia="Calibri" w:cs=""/>
-                <w:kern w:val="0"/>
-                <w:sz w:val="22"/>
-                <w:szCs w:val="22"/>
-                <w:lang w:val="en-US" w:eastAsia="en-US" w:bidi="ar-SA"/>
-              </w:rPr>
-              <w:t xml:space="preserve"> </w:t>
-            </w:r>
-            <w:r>
-              <w:rPr>
-                <w:rFonts w:eastAsia="Calibri" w:cs=""/>
-                <w:kern w:val="0"/>
-                <w:sz w:val="22"/>
-                <w:szCs w:val="22"/>
-                <w:lang w:val="en-US" w:eastAsia="en-US" w:bidi="ar-SA"/>
-              </w:rPr>
-              <w:t>p</w:t>
-            </w:r>
-            <w:r>
-              <w:rPr>
-                <w:rFonts w:eastAsia="Calibri" w:cs=""/>
-                <w:kern w:val="0"/>
-                <w:sz w:val="22"/>
-                <w:szCs w:val="22"/>
-                <w:lang w:val="en-US" w:eastAsia="en-US" w:bidi="ar-SA"/>
-              </w:rPr>
-              <w:t>m</w:t>
-            </w:r>
-          </w:p>
-        </w:tc>
-        <w:tc>
-          <w:tcPr>
-            <w:tcW w:w="1512" w:type="dxa"/>
-            <w:tcBorders/>
-          </w:tcPr>
-          <w:p>
-            <w:pPr>
-              <w:pStyle w:val="Normal"/>
-              <w:widowControl/>
-              <w:spacing w:lineRule="auto" w:line="240" w:before="0" w:after="0"/>
-              <w:jc w:val="left"/>
-              <w:rPr>
-                <w:rFonts w:ascii="Calibri" w:hAnsi="Calibri" w:eastAsia="Calibri" w:cs=""/>
-                <w:kern w:val="0"/>
-                <w:sz w:val="22"/>
-                <w:szCs w:val="22"/>
-                <w:lang w:val="en-US" w:eastAsia="en-US" w:bidi="ar-SA"/>
-              </w:rPr>
-            </w:pPr>
-            <w:r>
-              <w:rPr>
-                <w:rFonts w:eastAsia="Calibri" w:cs=""/>
-                <w:kern w:val="0"/>
-                <w:sz w:val="22"/>
-                <w:szCs w:val="22"/>
-                <w:lang w:val="en-US" w:eastAsia="en-US" w:bidi="ar-SA"/>
-              </w:rPr>
-              <w:t>15</w:t>
-            </w:r>
-            <w:r>
-              <w:rPr>
-                <w:rFonts w:eastAsia="Calibri" w:cs=""/>
-                <w:kern w:val="0"/>
-                <w:sz w:val="22"/>
-                <w:szCs w:val="22"/>
-                <w:lang w:val="en-US" w:eastAsia="en-US" w:bidi="ar-SA"/>
-              </w:rPr>
-              <w:t xml:space="preserve"> min</w:t>
+              <w:suppressAutoHyphens w:val="true"/>
+              <w:spacing w:lineRule="auto" w:line="240" w:before="0" w:after="0"/>
+              <w:jc w:val="left"/>
+              <w:rPr>
+                <w:rFonts w:ascii="Calibri" w:hAnsi="Calibri" w:eastAsia="Calibri" w:cs=""/>
+                <w:kern w:val="0"/>
+                <w:sz w:val="22"/>
+                <w:szCs w:val="22"/>
+                <w:lang w:val="en-US" w:eastAsia="en-US" w:bidi="ar-SA"/>
+              </w:rPr>
+            </w:pPr>
+            <w:r>
+              <w:rPr>
+                <w:rFonts w:eastAsia="Calibri" w:cs=""/>
+                <w:kern w:val="0"/>
+                <w:sz w:val="22"/>
+                <w:szCs w:val="22"/>
+                <w:lang w:val="en-US" w:eastAsia="en-US" w:bidi="ar-SA"/>
+              </w:rPr>
+              <w:t>2:30 pm</w:t>
+            </w:r>
+          </w:p>
+        </w:tc>
+        <w:tc>
+          <w:tcPr>
+            <w:tcW w:w="1633" w:type="dxa"/>
+            <w:tcBorders/>
+          </w:tcPr>
+          <w:p>
+            <w:pPr>
+              <w:pStyle w:val="Normal"/>
+              <w:widowControl/>
+              <w:suppressAutoHyphens w:val="true"/>
+              <w:spacing w:lineRule="auto" w:line="240" w:before="0" w:after="0"/>
+              <w:jc w:val="left"/>
+              <w:rPr>
+                <w:rFonts w:ascii="Calibri" w:hAnsi="Calibri" w:eastAsia="Calibri" w:cs=""/>
+                <w:kern w:val="0"/>
+                <w:sz w:val="22"/>
+                <w:szCs w:val="22"/>
+                <w:lang w:val="en-US" w:eastAsia="en-US" w:bidi="ar-SA"/>
+              </w:rPr>
+            </w:pPr>
+            <w:r>
+              <w:rPr>
+                <w:rFonts w:eastAsia="Calibri" w:cs=""/>
+                <w:kern w:val="0"/>
+                <w:sz w:val="22"/>
+                <w:szCs w:val="22"/>
+                <w:lang w:val="en-US" w:eastAsia="en-US" w:bidi="ar-SA"/>
+              </w:rPr>
+              <w:t>2:45 pm</w:t>
+            </w:r>
+          </w:p>
+        </w:tc>
+        <w:tc>
+          <w:tcPr>
+            <w:tcW w:w="1513" w:type="dxa"/>
+            <w:tcBorders/>
+          </w:tcPr>
+          <w:p>
+            <w:pPr>
+              <w:pStyle w:val="Normal"/>
+              <w:widowControl/>
+              <w:suppressAutoHyphens w:val="true"/>
+              <w:spacing w:lineRule="auto" w:line="240" w:before="0" w:after="0"/>
+              <w:jc w:val="left"/>
+              <w:rPr>
+                <w:rFonts w:ascii="Calibri" w:hAnsi="Calibri" w:eastAsia="Calibri" w:cs=""/>
+                <w:kern w:val="0"/>
+                <w:sz w:val="22"/>
+                <w:szCs w:val="22"/>
+                <w:lang w:val="en-US" w:eastAsia="en-US" w:bidi="ar-SA"/>
+              </w:rPr>
+            </w:pPr>
+            <w:r>
+              <w:rPr>
+                <w:rFonts w:eastAsia="Calibri" w:cs=""/>
+                <w:kern w:val="0"/>
+                <w:sz w:val="22"/>
+                <w:szCs w:val="22"/>
+                <w:lang w:val="en-US" w:eastAsia="en-US" w:bidi="ar-SA"/>
+              </w:rPr>
+              <w:t>15 min</w:t>
             </w:r>
           </w:p>
         </w:tc>
@@ -632,6 +501,7 @@
             <w:pPr>
               <w:pStyle w:val="Normal"/>
               <w:widowControl/>
+              <w:suppressAutoHyphens w:val="true"/>
               <w:spacing w:lineRule="auto" w:line="240" w:before="0" w:after="0"/>
               <w:jc w:val="left"/>
               <w:rPr>
@@ -662,24 +532,26 @@
             <w:pPr>
               <w:pStyle w:val="Normal"/>
               <w:widowControl/>
-              <w:spacing w:lineRule="auto" w:line="240" w:before="0" w:after="0"/>
-              <w:jc w:val="left"/>
-              <w:rPr>
-                <w:rFonts w:ascii="Calibri" w:hAnsi="Calibri" w:eastAsia="Calibri" w:cs=""/>
-                <w:kern w:val="0"/>
-                <w:sz w:val="22"/>
-                <w:szCs w:val="22"/>
-                <w:lang w:val="en-US" w:eastAsia="en-US" w:bidi="ar-SA"/>
-              </w:rPr>
-            </w:pPr>
-            <w:r>
-              <w:rPr>
-                <w:rFonts w:eastAsia="Calibri" w:cs=""/>
-                <w:kern w:val="0"/>
-                <w:sz w:val="22"/>
-                <w:szCs w:val="22"/>
-                <w:lang w:val="en-US" w:eastAsia="en-US" w:bidi="ar-SA"/>
-              </w:rPr>
+              <w:suppressAutoHyphens w:val="true"/>
+              <w:spacing w:lineRule="auto" w:line="240" w:before="0" w:after="0"/>
+              <w:jc w:val="left"/>
+              <w:rPr>
+                <w:rFonts w:ascii="Calibri" w:hAnsi="Calibri" w:eastAsia="Calibri" w:cs=""/>
+                <w:kern w:val="0"/>
+                <w:sz w:val="22"/>
+                <w:szCs w:val="22"/>
+                <w:lang w:val="en-US" w:eastAsia="en-US" w:bidi="ar-SA"/>
+              </w:rPr>
+            </w:pPr>
+            <w:r>
+              <w:rPr>
+                <w:rFonts w:eastAsia="Calibri" w:cs=""/>
+                <w:kern w:val="0"/>
+                <w:sz w:val="22"/>
+                <w:szCs w:val="22"/>
+                <w:lang w:val="en-US" w:eastAsia="en-US" w:bidi="ar-SA"/>
+              </w:rPr>
+              <w:t>Phase I Writing</w:t>
             </w:r>
           </w:p>
         </w:tc>
@@ -692,24 +564,34 @@
             <w:pPr>
               <w:pStyle w:val="Normal"/>
               <w:widowControl/>
-              <w:spacing w:lineRule="auto" w:line="240" w:before="0" w:after="0"/>
-              <w:jc w:val="left"/>
-              <w:rPr>
-                <w:rFonts w:ascii="Calibri" w:hAnsi="Calibri" w:eastAsia="Calibri" w:cs=""/>
-                <w:kern w:val="0"/>
-                <w:sz w:val="22"/>
-                <w:szCs w:val="22"/>
-                <w:lang w:val="en-US" w:eastAsia="en-US" w:bidi="ar-SA"/>
-              </w:rPr>
-            </w:pPr>
-            <w:r>
-              <w:rPr>
-                <w:rFonts w:eastAsia="Calibri" w:cs=""/>
-                <w:kern w:val="0"/>
-                <w:sz w:val="22"/>
-                <w:szCs w:val="22"/>
-                <w:lang w:val="en-US" w:eastAsia="en-US" w:bidi="ar-SA"/>
-              </w:rPr>
+              <w:suppressAutoHyphens w:val="true"/>
+              <w:spacing w:lineRule="auto" w:line="240" w:before="0" w:after="0"/>
+              <w:jc w:val="left"/>
+              <w:rPr>
+                <w:rFonts w:ascii="Calibri" w:hAnsi="Calibri" w:eastAsia="Calibri" w:cs=""/>
+                <w:kern w:val="0"/>
+                <w:sz w:val="22"/>
+                <w:szCs w:val="22"/>
+                <w:lang w:val="en-US" w:eastAsia="en-US" w:bidi="ar-SA"/>
+              </w:rPr>
+            </w:pPr>
+            <w:r>
+              <w:rPr>
+                <w:sz w:val="22"/>
+              </w:rPr>
+              <w:t>09/</w:t>
+            </w:r>
+            <w:r>
+              <w:rPr>
+                <w:sz w:val="22"/>
+              </w:rPr>
+              <w:t>20</w:t>
+            </w:r>
+            <w:r>
+              <w:rPr>
+                <w:sz w:val="22"/>
+              </w:rPr>
+              <w:t>/26</w:t>
             </w:r>
           </w:p>
         </w:tc>
@@ -722,84 +604,86 @@
             <w:pPr>
               <w:pStyle w:val="Normal"/>
               <w:widowControl/>
-              <w:spacing w:lineRule="auto" w:line="240" w:before="0" w:after="0"/>
-              <w:jc w:val="left"/>
-              <w:rPr>
-                <w:rFonts w:ascii="Calibri" w:hAnsi="Calibri" w:eastAsia="Calibri" w:cs=""/>
-                <w:kern w:val="0"/>
-                <w:sz w:val="22"/>
-                <w:szCs w:val="22"/>
-                <w:lang w:val="en-US" w:eastAsia="en-US" w:bidi="ar-SA"/>
-              </w:rPr>
-            </w:pPr>
-            <w:r>
-              <w:rPr>
-                <w:rFonts w:eastAsia="Calibri" w:cs=""/>
-                <w:kern w:val="0"/>
-                <w:sz w:val="22"/>
-                <w:szCs w:val="22"/>
-                <w:lang w:val="en-US" w:eastAsia="en-US" w:bidi="ar-SA"/>
-              </w:rPr>
-            </w:r>
-          </w:p>
-        </w:tc>
-        <w:tc>
-          <w:tcPr>
-            <w:tcW w:w="1634" w:type="dxa"/>
-            <w:tcBorders/>
-          </w:tcPr>
-          <w:p>
-            <w:pPr>
-              <w:pStyle w:val="Normal"/>
-              <w:widowControl/>
-              <w:spacing w:lineRule="auto" w:line="240" w:before="0" w:after="0"/>
-              <w:jc w:val="left"/>
-              <w:rPr>
-                <w:rFonts w:ascii="Calibri" w:hAnsi="Calibri" w:eastAsia="Calibri" w:cs=""/>
-                <w:kern w:val="0"/>
-                <w:sz w:val="22"/>
-                <w:szCs w:val="22"/>
-                <w:lang w:val="en-US" w:eastAsia="en-US" w:bidi="ar-SA"/>
-              </w:rPr>
-            </w:pPr>
-            <w:r>
-              <w:rPr>
-                <w:rFonts w:eastAsia="Calibri" w:cs=""/>
-                <w:kern w:val="0"/>
-                <w:sz w:val="22"/>
-                <w:szCs w:val="22"/>
-                <w:lang w:val="en-US" w:eastAsia="en-US" w:bidi="ar-SA"/>
-              </w:rPr>
-            </w:r>
-          </w:p>
-        </w:tc>
-        <w:tc>
-          <w:tcPr>
-            <w:tcW w:w="1512" w:type="dxa"/>
-            <w:tcBorders/>
-          </w:tcPr>
-          <w:p>
-            <w:pPr>
-              <w:pStyle w:val="Normal"/>
-              <w:widowControl/>
-              <w:spacing w:lineRule="auto" w:line="240" w:before="0" w:after="0"/>
-              <w:jc w:val="left"/>
-              <w:rPr>
-                <w:rFonts w:ascii="Calibri" w:hAnsi="Calibri" w:eastAsia="Calibri" w:cs=""/>
-                <w:kern w:val="0"/>
-                <w:sz w:val="22"/>
-                <w:szCs w:val="22"/>
-                <w:lang w:val="en-US" w:eastAsia="en-US" w:bidi="ar-SA"/>
-              </w:rPr>
-            </w:pPr>
-            <w:r>
-              <w:rPr>
-                <w:rFonts w:eastAsia="Calibri" w:cs=""/>
-                <w:kern w:val="0"/>
-                <w:sz w:val="22"/>
-                <w:szCs w:val="22"/>
-                <w:lang w:val="en-US" w:eastAsia="en-US" w:bidi="ar-SA"/>
-              </w:rPr>
+              <w:suppressAutoHyphens w:val="true"/>
+              <w:spacing w:lineRule="auto" w:line="240" w:before="0" w:after="0"/>
+              <w:jc w:val="left"/>
+              <w:rPr>
+                <w:rFonts w:ascii="Calibri" w:hAnsi="Calibri" w:eastAsia="Calibri" w:cs=""/>
+                <w:kern w:val="0"/>
+                <w:sz w:val="22"/>
+                <w:szCs w:val="22"/>
+                <w:lang w:val="en-US" w:eastAsia="en-US" w:bidi="ar-SA"/>
+              </w:rPr>
+            </w:pPr>
+            <w:r>
+              <w:rPr>
+                <w:sz w:val="22"/>
+              </w:rPr>
+              <w:t>2:30 pm</w:t>
+            </w:r>
+          </w:p>
+        </w:tc>
+        <w:tc>
+          <w:tcPr>
+            <w:tcW w:w="1633" w:type="dxa"/>
+            <w:tcBorders/>
+          </w:tcPr>
+          <w:p>
+            <w:pPr>
+              <w:pStyle w:val="Normal"/>
+              <w:widowControl/>
+              <w:suppressAutoHyphens w:val="true"/>
+              <w:spacing w:lineRule="auto" w:line="240" w:before="0" w:after="0"/>
+              <w:jc w:val="left"/>
+              <w:rPr>
+                <w:rFonts w:ascii="Calibri" w:hAnsi="Calibri" w:eastAsia="Calibri" w:cs=""/>
+                <w:kern w:val="0"/>
+                <w:sz w:val="22"/>
+                <w:szCs w:val="22"/>
+                <w:lang w:val="en-US" w:eastAsia="en-US" w:bidi="ar-SA"/>
+              </w:rPr>
+            </w:pPr>
+            <w:r>
+              <w:rPr>
+                <w:rFonts w:eastAsia="Calibri" w:cs=""/>
+                <w:kern w:val="0"/>
+                <w:sz w:val="22"/>
+                <w:szCs w:val="22"/>
+                <w:lang w:val="en-US" w:eastAsia="en-US" w:bidi="ar-SA"/>
+              </w:rPr>
+              <w:t>4:15 pm</w:t>
+            </w:r>
+          </w:p>
+        </w:tc>
+        <w:tc>
+          <w:tcPr>
+            <w:tcW w:w="1513" w:type="dxa"/>
+            <w:tcBorders/>
+          </w:tcPr>
+          <w:p>
+            <w:pPr>
+              <w:pStyle w:val="Normal"/>
+              <w:widowControl/>
+              <w:suppressAutoHyphens w:val="true"/>
+              <w:spacing w:lineRule="auto" w:line="240" w:before="0" w:after="0"/>
+              <w:jc w:val="left"/>
+              <w:rPr>
+                <w:rFonts w:ascii="Calibri" w:hAnsi="Calibri" w:eastAsia="Calibri" w:cs=""/>
+                <w:kern w:val="0"/>
+                <w:sz w:val="22"/>
+                <w:szCs w:val="22"/>
+                <w:lang w:val="en-US" w:eastAsia="en-US" w:bidi="ar-SA"/>
+              </w:rPr>
+            </w:pPr>
+            <w:r>
+              <w:rPr>
+                <w:rFonts w:eastAsia="Calibri" w:cs=""/>
+                <w:kern w:val="0"/>
+                <w:sz w:val="22"/>
+                <w:szCs w:val="22"/>
+                <w:lang w:val="en-US" w:eastAsia="en-US" w:bidi="ar-SA"/>
+              </w:rPr>
+              <w:t>45 min</w:t>
             </w:r>
           </w:p>
         </w:tc>
@@ -815,6 +699,7 @@
             <w:pPr>
               <w:pStyle w:val="Normal"/>
               <w:widowControl/>
+              <w:suppressAutoHyphens w:val="true"/>
               <w:spacing w:lineRule="auto" w:line="240" w:before="0" w:after="0"/>
               <w:jc w:val="left"/>
               <w:rPr>
@@ -845,6 +730,7 @@
             <w:pPr>
               <w:pStyle w:val="Normal"/>
               <w:widowControl/>
+              <w:suppressAutoHyphens w:val="true"/>
               <w:spacing w:lineRule="auto" w:line="240" w:before="0" w:after="0"/>
               <w:jc w:val="left"/>
               <w:rPr>
@@ -875,6 +761,7 @@
             <w:pPr>
               <w:pStyle w:val="Normal"/>
               <w:widowControl/>
+              <w:suppressAutoHyphens w:val="true"/>
               <w:spacing w:lineRule="auto" w:line="240" w:before="0" w:after="0"/>
               <w:jc w:val="left"/>
               <w:rPr>
@@ -905,66 +792,69 @@
             <w:pPr>
               <w:pStyle w:val="Normal"/>
               <w:widowControl/>
-              <w:spacing w:lineRule="auto" w:line="240" w:before="0" w:after="0"/>
-              <w:jc w:val="left"/>
-              <w:rPr>
-                <w:rFonts w:ascii="Calibri" w:hAnsi="Calibri" w:eastAsia="Calibri" w:cs=""/>
-                <w:kern w:val="0"/>
-                <w:sz w:val="22"/>
-                <w:szCs w:val="22"/>
-                <w:lang w:val="en-US" w:eastAsia="en-US" w:bidi="ar-SA"/>
-              </w:rPr>
-            </w:pPr>
-            <w:r>
-              <w:rPr>
-                <w:rFonts w:eastAsia="Calibri" w:cs=""/>
-                <w:kern w:val="0"/>
-                <w:sz w:val="22"/>
-                <w:szCs w:val="22"/>
-                <w:lang w:val="en-US" w:eastAsia="en-US" w:bidi="ar-SA"/>
-              </w:rPr>
-            </w:r>
-          </w:p>
-        </w:tc>
-        <w:tc>
-          <w:tcPr>
-            <w:tcW w:w="1634" w:type="dxa"/>
-            <w:tcBorders/>
-          </w:tcPr>
-          <w:p>
-            <w:pPr>
-              <w:pStyle w:val="Normal"/>
-              <w:widowControl/>
-              <w:spacing w:lineRule="auto" w:line="240" w:before="0" w:after="0"/>
-              <w:jc w:val="left"/>
-              <w:rPr>
-                <w:rFonts w:ascii="Calibri" w:hAnsi="Calibri" w:eastAsia="Calibri" w:cs=""/>
-                <w:kern w:val="0"/>
-                <w:sz w:val="22"/>
-                <w:szCs w:val="22"/>
-                <w:lang w:val="en-US" w:eastAsia="en-US" w:bidi="ar-SA"/>
-              </w:rPr>
-            </w:pPr>
-            <w:r>
-              <w:rPr>
-                <w:rFonts w:eastAsia="Calibri" w:cs=""/>
-                <w:kern w:val="0"/>
-                <w:sz w:val="22"/>
-                <w:szCs w:val="22"/>
-                <w:lang w:val="en-US" w:eastAsia="en-US" w:bidi="ar-SA"/>
-              </w:rPr>
-            </w:r>
-          </w:p>
-        </w:tc>
-        <w:tc>
-          <w:tcPr>
-            <w:tcW w:w="1512" w:type="dxa"/>
-            <w:tcBorders/>
-          </w:tcPr>
-          <w:p>
-            <w:pPr>
-              <w:pStyle w:val="Normal"/>
-              <w:widowControl/>
+              <w:suppressAutoHyphens w:val="true"/>
+              <w:spacing w:lineRule="auto" w:line="240" w:before="0" w:after="0"/>
+              <w:jc w:val="left"/>
+              <w:rPr>
+                <w:rFonts w:ascii="Calibri" w:hAnsi="Calibri" w:eastAsia="Calibri" w:cs=""/>
+                <w:kern w:val="0"/>
+                <w:sz w:val="22"/>
+                <w:szCs w:val="22"/>
+                <w:lang w:val="en-US" w:eastAsia="en-US" w:bidi="ar-SA"/>
+              </w:rPr>
+            </w:pPr>
+            <w:r>
+              <w:rPr>
+                <w:rFonts w:eastAsia="Calibri" w:cs=""/>
+                <w:kern w:val="0"/>
+                <w:sz w:val="22"/>
+                <w:szCs w:val="22"/>
+                <w:lang w:val="en-US" w:eastAsia="en-US" w:bidi="ar-SA"/>
+              </w:rPr>
+            </w:r>
+          </w:p>
+        </w:tc>
+        <w:tc>
+          <w:tcPr>
+            <w:tcW w:w="1633" w:type="dxa"/>
+            <w:tcBorders/>
+          </w:tcPr>
+          <w:p>
+            <w:pPr>
+              <w:pStyle w:val="Normal"/>
+              <w:widowControl/>
+              <w:suppressAutoHyphens w:val="true"/>
+              <w:spacing w:lineRule="auto" w:line="240" w:before="0" w:after="0"/>
+              <w:jc w:val="left"/>
+              <w:rPr>
+                <w:rFonts w:ascii="Calibri" w:hAnsi="Calibri" w:eastAsia="Calibri" w:cs=""/>
+                <w:kern w:val="0"/>
+                <w:sz w:val="22"/>
+                <w:szCs w:val="22"/>
+                <w:lang w:val="en-US" w:eastAsia="en-US" w:bidi="ar-SA"/>
+              </w:rPr>
+            </w:pPr>
+            <w:r>
+              <w:rPr>
+                <w:rFonts w:eastAsia="Calibri" w:cs=""/>
+                <w:kern w:val="0"/>
+                <w:sz w:val="22"/>
+                <w:szCs w:val="22"/>
+                <w:lang w:val="en-US" w:eastAsia="en-US" w:bidi="ar-SA"/>
+              </w:rPr>
+            </w:r>
+          </w:p>
+        </w:tc>
+        <w:tc>
+          <w:tcPr>
+            <w:tcW w:w="1513" w:type="dxa"/>
+            <w:tcBorders/>
+          </w:tcPr>
+          <w:p>
+            <w:pPr>
+              <w:pStyle w:val="Normal"/>
+              <w:widowControl/>
+              <w:suppressAutoHyphens w:val="true"/>
               <w:spacing w:lineRule="auto" w:line="240" w:before="0" w:after="0"/>
               <w:jc w:val="left"/>
               <w:rPr>
@@ -985,11 +875,32 @@
               </w:rPr>
               <w:t>Week total:</w:t>
             </w:r>
-          </w:p>
-          <w:p>
-            <w:pPr>
-              <w:pStyle w:val="Normal"/>
-              <w:widowControl/>
+            <w:r>
+              <w:rPr>
+                <w:rFonts w:eastAsia="Calibri" w:cs=""/>
+                <w:kern w:val="0"/>
+                <w:sz w:val="22"/>
+                <w:szCs w:val="22"/>
+                <w:lang w:val="en-US" w:eastAsia="en-US" w:bidi="ar-SA"/>
+              </w:rPr>
+              <w:t xml:space="preserve"> </w:t>
+            </w:r>
+            <w:r>
+              <w:rPr>
+                <w:rFonts w:eastAsia="Calibri" w:cs=""/>
+                <w:kern w:val="0"/>
+                <w:sz w:val="22"/>
+                <w:szCs w:val="22"/>
+                <w:lang w:val="en-US" w:eastAsia="en-US" w:bidi="ar-SA"/>
+              </w:rPr>
+              <w:t>60 min</w:t>
+            </w:r>
+          </w:p>
+          <w:p>
+            <w:pPr>
+              <w:pStyle w:val="Normal"/>
+              <w:widowControl/>
+              <w:suppressAutoHyphens w:val="true"/>
               <w:spacing w:lineRule="auto" w:line="240" w:before="0" w:after="0"/>
               <w:jc w:val="left"/>
               <w:rPr>
@@ -1023,6 +934,7 @@
             <w:pPr>
               <w:pStyle w:val="Normal"/>
               <w:widowControl/>
+              <w:suppressAutoHyphens w:val="true"/>
               <w:spacing w:lineRule="auto" w:line="240" w:before="0" w:after="0"/>
               <w:jc w:val="left"/>
               <w:rPr>
@@ -1048,6 +960,7 @@
             <w:pPr>
               <w:pStyle w:val="Normal"/>
               <w:widowControl/>
+              <w:suppressAutoHyphens w:val="true"/>
               <w:spacing w:lineRule="auto" w:line="240" w:before="0" w:after="0"/>
               <w:jc w:val="left"/>
               <w:rPr>
@@ -1078,6 +991,7 @@
             <w:pPr>
               <w:pStyle w:val="Normal"/>
               <w:widowControl/>
+              <w:suppressAutoHyphens w:val="true"/>
               <w:spacing w:lineRule="auto" w:line="240" w:before="0" w:after="0"/>
               <w:jc w:val="left"/>
               <w:rPr>
@@ -1108,6 +1022,7 @@
             <w:pPr>
               <w:pStyle w:val="Normal"/>
               <w:widowControl/>
+              <w:suppressAutoHyphens w:val="true"/>
               <w:spacing w:lineRule="auto" w:line="240" w:before="0" w:after="0"/>
               <w:jc w:val="left"/>
               <w:rPr>
@@ -1138,66 +1053,69 @@
             <w:pPr>
               <w:pStyle w:val="Normal"/>
               <w:widowControl/>
-              <w:spacing w:lineRule="auto" w:line="240" w:before="0" w:after="0"/>
-              <w:jc w:val="left"/>
-              <w:rPr>
-                <w:rFonts w:ascii="Calibri" w:hAnsi="Calibri" w:eastAsia="Calibri" w:cs=""/>
-                <w:kern w:val="0"/>
-                <w:sz w:val="22"/>
-                <w:szCs w:val="22"/>
-                <w:lang w:val="en-US" w:eastAsia="en-US" w:bidi="ar-SA"/>
-              </w:rPr>
-            </w:pPr>
-            <w:r>
-              <w:rPr>
-                <w:rFonts w:eastAsia="Calibri" w:cs=""/>
-                <w:kern w:val="0"/>
-                <w:sz w:val="22"/>
-                <w:szCs w:val="22"/>
-                <w:lang w:val="en-US" w:eastAsia="en-US" w:bidi="ar-SA"/>
-              </w:rPr>
-            </w:r>
-          </w:p>
-        </w:tc>
-        <w:tc>
-          <w:tcPr>
-            <w:tcW w:w="1634" w:type="dxa"/>
-            <w:tcBorders/>
-          </w:tcPr>
-          <w:p>
-            <w:pPr>
-              <w:pStyle w:val="Normal"/>
-              <w:widowControl/>
-              <w:spacing w:lineRule="auto" w:line="240" w:before="0" w:after="0"/>
-              <w:jc w:val="left"/>
-              <w:rPr>
-                <w:rFonts w:ascii="Calibri" w:hAnsi="Calibri" w:eastAsia="Calibri" w:cs=""/>
-                <w:kern w:val="0"/>
-                <w:sz w:val="22"/>
-                <w:szCs w:val="22"/>
-                <w:lang w:val="en-US" w:eastAsia="en-US" w:bidi="ar-SA"/>
-              </w:rPr>
-            </w:pPr>
-            <w:r>
-              <w:rPr>
-                <w:rFonts w:eastAsia="Calibri" w:cs=""/>
-                <w:kern w:val="0"/>
-                <w:sz w:val="22"/>
-                <w:szCs w:val="22"/>
-                <w:lang w:val="en-US" w:eastAsia="en-US" w:bidi="ar-SA"/>
-              </w:rPr>
-            </w:r>
-          </w:p>
-        </w:tc>
-        <w:tc>
-          <w:tcPr>
-            <w:tcW w:w="1512" w:type="dxa"/>
-            <w:tcBorders/>
-          </w:tcPr>
-          <w:p>
-            <w:pPr>
-              <w:pStyle w:val="Normal"/>
-              <w:widowControl/>
+              <w:suppressAutoHyphens w:val="true"/>
+              <w:spacing w:lineRule="auto" w:line="240" w:before="0" w:after="0"/>
+              <w:jc w:val="left"/>
+              <w:rPr>
+                <w:rFonts w:ascii="Calibri" w:hAnsi="Calibri" w:eastAsia="Calibri" w:cs=""/>
+                <w:kern w:val="0"/>
+                <w:sz w:val="22"/>
+                <w:szCs w:val="22"/>
+                <w:lang w:val="en-US" w:eastAsia="en-US" w:bidi="ar-SA"/>
+              </w:rPr>
+            </w:pPr>
+            <w:r>
+              <w:rPr>
+                <w:rFonts w:eastAsia="Calibri" w:cs=""/>
+                <w:kern w:val="0"/>
+                <w:sz w:val="22"/>
+                <w:szCs w:val="22"/>
+                <w:lang w:val="en-US" w:eastAsia="en-US" w:bidi="ar-SA"/>
+              </w:rPr>
+            </w:r>
+          </w:p>
+        </w:tc>
+        <w:tc>
+          <w:tcPr>
+            <w:tcW w:w="1633" w:type="dxa"/>
+            <w:tcBorders/>
+          </w:tcPr>
+          <w:p>
+            <w:pPr>
+              <w:pStyle w:val="Normal"/>
+              <w:widowControl/>
+              <w:suppressAutoHyphens w:val="true"/>
+              <w:spacing w:lineRule="auto" w:line="240" w:before="0" w:after="0"/>
+              <w:jc w:val="left"/>
+              <w:rPr>
+                <w:rFonts w:ascii="Calibri" w:hAnsi="Calibri" w:eastAsia="Calibri" w:cs=""/>
+                <w:kern w:val="0"/>
+                <w:sz w:val="22"/>
+                <w:szCs w:val="22"/>
+                <w:lang w:val="en-US" w:eastAsia="en-US" w:bidi="ar-SA"/>
+              </w:rPr>
+            </w:pPr>
+            <w:r>
+              <w:rPr>
+                <w:rFonts w:eastAsia="Calibri" w:cs=""/>
+                <w:kern w:val="0"/>
+                <w:sz w:val="22"/>
+                <w:szCs w:val="22"/>
+                <w:lang w:val="en-US" w:eastAsia="en-US" w:bidi="ar-SA"/>
+              </w:rPr>
+            </w:r>
+          </w:p>
+        </w:tc>
+        <w:tc>
+          <w:tcPr>
+            <w:tcW w:w="1513" w:type="dxa"/>
+            <w:tcBorders/>
+          </w:tcPr>
+          <w:p>
+            <w:pPr>
+              <w:pStyle w:val="Normal"/>
+              <w:widowControl/>
+              <w:suppressAutoHyphens w:val="true"/>
               <w:spacing w:lineRule="auto" w:line="240" w:before="0" w:after="0"/>
               <w:jc w:val="left"/>
               <w:rPr>
@@ -1231,6 +1149,7 @@
             <w:pPr>
               <w:pStyle w:val="Normal"/>
               <w:widowControl/>
+              <w:suppressAutoHyphens w:val="true"/>
               <w:spacing w:lineRule="auto" w:line="240" w:before="0" w:after="0"/>
               <w:jc w:val="left"/>
               <w:rPr>
@@ -1261,6 +1180,7 @@
             <w:pPr>
               <w:pStyle w:val="Normal"/>
               <w:widowControl/>
+              <w:suppressAutoHyphens w:val="true"/>
               <w:spacing w:lineRule="auto" w:line="240" w:before="0" w:after="0"/>
               <w:jc w:val="left"/>
               <w:rPr>
@@ -1291,6 +1211,7 @@
             <w:pPr>
               <w:pStyle w:val="Normal"/>
               <w:widowControl/>
+              <w:suppressAutoHyphens w:val="true"/>
               <w:spacing w:lineRule="auto" w:line="240" w:before="0" w:after="0"/>
               <w:jc w:val="left"/>
               <w:rPr>
@@ -1321,66 +1242,69 @@
             <w:pPr>
               <w:pStyle w:val="Normal"/>
               <w:widowControl/>
-              <w:spacing w:lineRule="auto" w:line="240" w:before="0" w:after="0"/>
-              <w:jc w:val="left"/>
-              <w:rPr>
-                <w:rFonts w:ascii="Calibri" w:hAnsi="Calibri" w:eastAsia="Calibri" w:cs=""/>
-                <w:kern w:val="0"/>
-                <w:sz w:val="22"/>
-                <w:szCs w:val="22"/>
-                <w:lang w:val="en-US" w:eastAsia="en-US" w:bidi="ar-SA"/>
-              </w:rPr>
-            </w:pPr>
-            <w:r>
-              <w:rPr>
-                <w:rFonts w:eastAsia="Calibri" w:cs=""/>
-                <w:kern w:val="0"/>
-                <w:sz w:val="22"/>
-                <w:szCs w:val="22"/>
-                <w:lang w:val="en-US" w:eastAsia="en-US" w:bidi="ar-SA"/>
-              </w:rPr>
-            </w:r>
-          </w:p>
-        </w:tc>
-        <w:tc>
-          <w:tcPr>
-            <w:tcW w:w="1634" w:type="dxa"/>
-            <w:tcBorders/>
-          </w:tcPr>
-          <w:p>
-            <w:pPr>
-              <w:pStyle w:val="Normal"/>
-              <w:widowControl/>
-              <w:spacing w:lineRule="auto" w:line="240" w:before="0" w:after="0"/>
-              <w:jc w:val="left"/>
-              <w:rPr>
-                <w:rFonts w:ascii="Calibri" w:hAnsi="Calibri" w:eastAsia="Calibri" w:cs=""/>
-                <w:kern w:val="0"/>
-                <w:sz w:val="22"/>
-                <w:szCs w:val="22"/>
-                <w:lang w:val="en-US" w:eastAsia="en-US" w:bidi="ar-SA"/>
-              </w:rPr>
-            </w:pPr>
-            <w:r>
-              <w:rPr>
-                <w:rFonts w:eastAsia="Calibri" w:cs=""/>
-                <w:kern w:val="0"/>
-                <w:sz w:val="22"/>
-                <w:szCs w:val="22"/>
-                <w:lang w:val="en-US" w:eastAsia="en-US" w:bidi="ar-SA"/>
-              </w:rPr>
-            </w:r>
-          </w:p>
-        </w:tc>
-        <w:tc>
-          <w:tcPr>
-            <w:tcW w:w="1512" w:type="dxa"/>
-            <w:tcBorders/>
-          </w:tcPr>
-          <w:p>
-            <w:pPr>
-              <w:pStyle w:val="Normal"/>
-              <w:widowControl/>
+              <w:suppressAutoHyphens w:val="true"/>
+              <w:spacing w:lineRule="auto" w:line="240" w:before="0" w:after="0"/>
+              <w:jc w:val="left"/>
+              <w:rPr>
+                <w:rFonts w:ascii="Calibri" w:hAnsi="Calibri" w:eastAsia="Calibri" w:cs=""/>
+                <w:kern w:val="0"/>
+                <w:sz w:val="22"/>
+                <w:szCs w:val="22"/>
+                <w:lang w:val="en-US" w:eastAsia="en-US" w:bidi="ar-SA"/>
+              </w:rPr>
+            </w:pPr>
+            <w:r>
+              <w:rPr>
+                <w:rFonts w:eastAsia="Calibri" w:cs=""/>
+                <w:kern w:val="0"/>
+                <w:sz w:val="22"/>
+                <w:szCs w:val="22"/>
+                <w:lang w:val="en-US" w:eastAsia="en-US" w:bidi="ar-SA"/>
+              </w:rPr>
+            </w:r>
+          </w:p>
+        </w:tc>
+        <w:tc>
+          <w:tcPr>
+            <w:tcW w:w="1633" w:type="dxa"/>
+            <w:tcBorders/>
+          </w:tcPr>
+          <w:p>
+            <w:pPr>
+              <w:pStyle w:val="Normal"/>
+              <w:widowControl/>
+              <w:suppressAutoHyphens w:val="true"/>
+              <w:spacing w:lineRule="auto" w:line="240" w:before="0" w:after="0"/>
+              <w:jc w:val="left"/>
+              <w:rPr>
+                <w:rFonts w:ascii="Calibri" w:hAnsi="Calibri" w:eastAsia="Calibri" w:cs=""/>
+                <w:kern w:val="0"/>
+                <w:sz w:val="22"/>
+                <w:szCs w:val="22"/>
+                <w:lang w:val="en-US" w:eastAsia="en-US" w:bidi="ar-SA"/>
+              </w:rPr>
+            </w:pPr>
+            <w:r>
+              <w:rPr>
+                <w:rFonts w:eastAsia="Calibri" w:cs=""/>
+                <w:kern w:val="0"/>
+                <w:sz w:val="22"/>
+                <w:szCs w:val="22"/>
+                <w:lang w:val="en-US" w:eastAsia="en-US" w:bidi="ar-SA"/>
+              </w:rPr>
+            </w:r>
+          </w:p>
+        </w:tc>
+        <w:tc>
+          <w:tcPr>
+            <w:tcW w:w="1513" w:type="dxa"/>
+            <w:tcBorders/>
+          </w:tcPr>
+          <w:p>
+            <w:pPr>
+              <w:pStyle w:val="Normal"/>
+              <w:widowControl/>
+              <w:suppressAutoHyphens w:val="true"/>
               <w:spacing w:lineRule="auto" w:line="240" w:before="0" w:after="0"/>
               <w:jc w:val="left"/>
               <w:rPr>
@@ -1414,6 +1338,7 @@
             <w:pPr>
               <w:pStyle w:val="Normal"/>
               <w:widowControl/>
+              <w:suppressAutoHyphens w:val="true"/>
               <w:spacing w:lineRule="auto" w:line="240" w:before="0" w:after="0"/>
               <w:jc w:val="left"/>
               <w:rPr>
@@ -1444,6 +1369,7 @@
             <w:pPr>
               <w:pStyle w:val="Normal"/>
               <w:widowControl/>
+              <w:suppressAutoHyphens w:val="true"/>
               <w:spacing w:lineRule="auto" w:line="240" w:before="0" w:after="0"/>
               <w:jc w:val="left"/>
               <w:rPr>
@@ -1474,6 +1400,7 @@
             <w:pPr>
               <w:pStyle w:val="Normal"/>
               <w:widowControl/>
+              <w:suppressAutoHyphens w:val="true"/>
               <w:spacing w:lineRule="auto" w:line="240" w:before="0" w:after="0"/>
               <w:jc w:val="left"/>
               <w:rPr>
@@ -1504,66 +1431,69 @@
             <w:pPr>
               <w:pStyle w:val="Normal"/>
               <w:widowControl/>
-              <w:spacing w:lineRule="auto" w:line="240" w:before="0" w:after="0"/>
-              <w:jc w:val="left"/>
-              <w:rPr>
-                <w:rFonts w:ascii="Calibri" w:hAnsi="Calibri" w:eastAsia="Calibri" w:cs=""/>
-                <w:kern w:val="0"/>
-                <w:sz w:val="22"/>
-                <w:szCs w:val="22"/>
-                <w:lang w:val="en-US" w:eastAsia="en-US" w:bidi="ar-SA"/>
-              </w:rPr>
-            </w:pPr>
-            <w:r>
-              <w:rPr>
-                <w:rFonts w:eastAsia="Calibri" w:cs=""/>
-                <w:kern w:val="0"/>
-                <w:sz w:val="22"/>
-                <w:szCs w:val="22"/>
-                <w:lang w:val="en-US" w:eastAsia="en-US" w:bidi="ar-SA"/>
-              </w:rPr>
-            </w:r>
-          </w:p>
-        </w:tc>
-        <w:tc>
-          <w:tcPr>
-            <w:tcW w:w="1634" w:type="dxa"/>
-            <w:tcBorders/>
-          </w:tcPr>
-          <w:p>
-            <w:pPr>
-              <w:pStyle w:val="Normal"/>
-              <w:widowControl/>
-              <w:spacing w:lineRule="auto" w:line="240" w:before="0" w:after="0"/>
-              <w:jc w:val="left"/>
-              <w:rPr>
-                <w:rFonts w:ascii="Calibri" w:hAnsi="Calibri" w:eastAsia="Calibri" w:cs=""/>
-                <w:kern w:val="0"/>
-                <w:sz w:val="22"/>
-                <w:szCs w:val="22"/>
-                <w:lang w:val="en-US" w:eastAsia="en-US" w:bidi="ar-SA"/>
-              </w:rPr>
-            </w:pPr>
-            <w:r>
-              <w:rPr>
-                <w:rFonts w:eastAsia="Calibri" w:cs=""/>
-                <w:kern w:val="0"/>
-                <w:sz w:val="22"/>
-                <w:szCs w:val="22"/>
-                <w:lang w:val="en-US" w:eastAsia="en-US" w:bidi="ar-SA"/>
-              </w:rPr>
-            </w:r>
-          </w:p>
-        </w:tc>
-        <w:tc>
-          <w:tcPr>
-            <w:tcW w:w="1512" w:type="dxa"/>
-            <w:tcBorders/>
-          </w:tcPr>
-          <w:p>
-            <w:pPr>
-              <w:pStyle w:val="Normal"/>
-              <w:widowControl/>
+              <w:suppressAutoHyphens w:val="true"/>
+              <w:spacing w:lineRule="auto" w:line="240" w:before="0" w:after="0"/>
+              <w:jc w:val="left"/>
+              <w:rPr>
+                <w:rFonts w:ascii="Calibri" w:hAnsi="Calibri" w:eastAsia="Calibri" w:cs=""/>
+                <w:kern w:val="0"/>
+                <w:sz w:val="22"/>
+                <w:szCs w:val="22"/>
+                <w:lang w:val="en-US" w:eastAsia="en-US" w:bidi="ar-SA"/>
+              </w:rPr>
+            </w:pPr>
+            <w:r>
+              <w:rPr>
+                <w:rFonts w:eastAsia="Calibri" w:cs=""/>
+                <w:kern w:val="0"/>
+                <w:sz w:val="22"/>
+                <w:szCs w:val="22"/>
+                <w:lang w:val="en-US" w:eastAsia="en-US" w:bidi="ar-SA"/>
+              </w:rPr>
+            </w:r>
+          </w:p>
+        </w:tc>
+        <w:tc>
+          <w:tcPr>
+            <w:tcW w:w="1633" w:type="dxa"/>
+            <w:tcBorders/>
+          </w:tcPr>
+          <w:p>
+            <w:pPr>
+              <w:pStyle w:val="Normal"/>
+              <w:widowControl/>
+              <w:suppressAutoHyphens w:val="true"/>
+              <w:spacing w:lineRule="auto" w:line="240" w:before="0" w:after="0"/>
+              <w:jc w:val="left"/>
+              <w:rPr>
+                <w:rFonts w:ascii="Calibri" w:hAnsi="Calibri" w:eastAsia="Calibri" w:cs=""/>
+                <w:kern w:val="0"/>
+                <w:sz w:val="22"/>
+                <w:szCs w:val="22"/>
+                <w:lang w:val="en-US" w:eastAsia="en-US" w:bidi="ar-SA"/>
+              </w:rPr>
+            </w:pPr>
+            <w:r>
+              <w:rPr>
+                <w:rFonts w:eastAsia="Calibri" w:cs=""/>
+                <w:kern w:val="0"/>
+                <w:sz w:val="22"/>
+                <w:szCs w:val="22"/>
+                <w:lang w:val="en-US" w:eastAsia="en-US" w:bidi="ar-SA"/>
+              </w:rPr>
+            </w:r>
+          </w:p>
+        </w:tc>
+        <w:tc>
+          <w:tcPr>
+            <w:tcW w:w="1513" w:type="dxa"/>
+            <w:tcBorders/>
+          </w:tcPr>
+          <w:p>
+            <w:pPr>
+              <w:pStyle w:val="Normal"/>
+              <w:widowControl/>
+              <w:suppressAutoHyphens w:val="true"/>
               <w:spacing w:lineRule="auto" w:line="240" w:before="0" w:after="0"/>
               <w:jc w:val="left"/>
               <w:rPr>
@@ -2014,6 +1944,7 @@
     <w:rsid w:val="00562690"/>
     <w:pPr>
       <w:widowControl/>
+      <w:suppressAutoHyphens w:val="true"/>
       <w:bidi w:val="0"/>
       <w:spacing w:lineRule="auto" w:line="276" w:before="0" w:after="200"/>
       <w:jc w:val="left"/>
@@ -2093,8 +2024,34 @@
       <w:rFonts w:cs="Arial"/>
     </w:rPr>
   </w:style>
-  <w:style w:type="numbering" w:styleId="Style16" w:default="1">
-    <w:name w:val="Без маркерів"/>
+  <w:style w:type="paragraph" w:styleId="user">
+    <w:name w:val="Заголовок (user)"/>
+    <w:basedOn w:val="Normal"/>
+    <w:next w:val="BodyText"/>
+    <w:qFormat/>
+    <w:pPr>
+      <w:keepNext w:val="true"/>
+      <w:spacing w:before="240" w:after="120"/>
+    </w:pPr>
+    <w:rPr>
+      <w:rFonts w:ascii="Liberation Sans" w:hAnsi="Liberation Sans" w:eastAsia="Microsoft YaHei" w:cs="Arial"/>
+      <w:sz w:val="28"/>
+      <w:szCs w:val="28"/>
+    </w:rPr>
+  </w:style>
+  <w:style w:type="paragraph" w:styleId="user1">
+    <w:name w:val="Покажчик (user)"/>
+    <w:basedOn w:val="Normal"/>
+    <w:qFormat/>
+    <w:pPr>
+      <w:suppressLineNumbers/>
+    </w:pPr>
+    <w:rPr>
+      <w:rFonts w:cs="Arial"/>
+    </w:rPr>
+  </w:style>
+  <w:style w:type="numbering" w:styleId="user2" w:default="1">
+    <w:name w:val="Без маркерів (user)"/>
     <w:uiPriority w:val="99"/>
     <w:semiHidden/>
     <w:unhideWhenUsed/>

</xml_diff>

<commit_message>
Added the import templates and the UI mockup to the git.
</commit_message>
<xml_diff>
--- a/Reports, Logs & Evaluations/Time Logs/Ovcharenko/Time Log.docx
+++ b/Reports, Logs & Evaluations/Time Logs/Ovcharenko/Time Log.docx
@@ -1751,27 +1751,7 @@
                 <w:szCs w:val="22"/>
                 <w:lang w:val="en-US" w:eastAsia="en-US" w:bidi="ar-SA"/>
               </w:rPr>
-              <w:t>Updating Mockup &amp; User Guide</w:t>
-            </w:r>
-            <w:r>
-              <w:rPr>
-                <w:rFonts w:eastAsia="Calibri" w:cs=""/>
-                <w:kern w:val="0"/>
-                <w:sz w:val="22"/>
-                <w:szCs w:val="22"/>
-                <w:lang w:val="en-US" w:eastAsia="en-US" w:bidi="ar-SA"/>
-              </w:rPr>
-              <w:t xml:space="preserve"> </w:t>
-            </w:r>
-            <w:r>
-              <w:rPr>
-                <w:rFonts w:eastAsia="Calibri" w:cs=""/>
-                <w:kern w:val="0"/>
-                <w:sz w:val="22"/>
-                <w:szCs w:val="22"/>
-                <w:lang w:val="en-US" w:eastAsia="en-US" w:bidi="ar-SA"/>
-              </w:rPr>
-              <w:t>(1)</w:t>
+              <w:t>Updating Mockup &amp; User Guide (1)</w:t>
             </w:r>
           </w:p>
         </w:tc>
@@ -1973,17 +1953,7 @@
                 <w:szCs w:val="22"/>
                 <w:lang w:val="en-US" w:eastAsia="en-US" w:bidi="ar-SA"/>
               </w:rPr>
-              <w:t xml:space="preserve">Updating Mockup &amp; User Guide </w:t>
-            </w:r>
-            <w:r>
-              <w:rPr>
-                <w:rFonts w:eastAsia="Calibri" w:cs=""/>
-                <w:kern w:val="0"/>
-                <w:sz w:val="22"/>
-                <w:szCs w:val="22"/>
-                <w:lang w:val="en-US" w:eastAsia="en-US" w:bidi="ar-SA"/>
-              </w:rPr>
-              <w:t>(2)</w:t>
+              <w:t>Updating Mockup &amp; User Guide (2)</w:t>
             </w:r>
           </w:p>
         </w:tc>
@@ -2013,19 +1983,7 @@
               <w:rPr>
                 <w:sz w:val="22"/>
               </w:rPr>
-              <w:t>09/2</w:t>
-            </w:r>
-            <w:r>
-              <w:rPr>
-                <w:sz w:val="22"/>
-              </w:rPr>
-              <w:t>6</w:t>
-            </w:r>
-            <w:r>
-              <w:rPr>
-                <w:sz w:val="22"/>
-              </w:rPr>
-              <w:t>/26</w:t>
+              <w:t>09/26/26</w:t>
             </w:r>
           </w:p>
         </w:tc>
@@ -2055,13 +2013,7 @@
               <w:rPr>
                 <w:sz w:val="22"/>
               </w:rPr>
-              <w:t>2</w:t>
-            </w:r>
-            <w:r>
-              <w:rPr>
-                <w:sz w:val="22"/>
-              </w:rPr>
-              <w:t>:00 pm</w:t>
+              <w:t>2:00 pm</w:t>
             </w:r>
           </w:p>
         </w:tc>
@@ -2095,37 +2047,7 @@
                 <w:szCs w:val="22"/>
                 <w:lang w:val="en-US" w:eastAsia="en-US" w:bidi="ar-SA"/>
               </w:rPr>
-              <w:t>4</w:t>
-            </w:r>
-            <w:r>
-              <w:rPr>
-                <w:rFonts w:eastAsia="Calibri" w:cs=""/>
-                <w:kern w:val="0"/>
-                <w:sz w:val="22"/>
-                <w:szCs w:val="22"/>
-                <w:lang w:val="en-US" w:eastAsia="en-US" w:bidi="ar-SA"/>
-              </w:rPr>
-              <w:t>:</w:t>
-            </w:r>
-            <w:r>
-              <w:rPr>
-                <w:rFonts w:eastAsia="Calibri" w:cs=""/>
-                <w:kern w:val="0"/>
-                <w:sz w:val="22"/>
-                <w:szCs w:val="22"/>
-                <w:lang w:val="en-US" w:eastAsia="en-US" w:bidi="ar-SA"/>
-              </w:rPr>
-              <w:t>30</w:t>
-            </w:r>
-            <w:r>
-              <w:rPr>
-                <w:rFonts w:eastAsia="Calibri" w:cs=""/>
-                <w:kern w:val="0"/>
-                <w:sz w:val="22"/>
-                <w:szCs w:val="22"/>
-                <w:lang w:val="en-US" w:eastAsia="en-US" w:bidi="ar-SA"/>
-              </w:rPr>
-              <w:t xml:space="preserve"> pm</w:t>
+              <w:t>4:30 pm</w:t>
             </w:r>
           </w:p>
         </w:tc>
@@ -2357,19 +2279,511 @@
               <w:rPr>
                 <w:sz w:val="22"/>
               </w:rPr>
-              <w:t xml:space="preserve">Week total: </w:t>
-            </w:r>
-            <w:r>
-              <w:rPr>
-                <w:sz w:val="22"/>
-              </w:rPr>
-              <w:t>600</w:t>
-            </w:r>
-            <w:r>
-              <w:rPr>
-                <w:sz w:val="22"/>
-              </w:rPr>
-              <w:t xml:space="preserve"> min</w:t>
+              <w:t>Week total: 600 min</w:t>
+            </w:r>
+          </w:p>
+        </w:tc>
+      </w:tr>
+      <w:tr>
+        <w:trPr/>
+        <w:tc>
+          <w:tcPr>
+            <w:tcW w:w="1819" w:type="dxa"/>
+            <w:tcBorders>
+              <w:top w:val="nil"/>
+            </w:tcBorders>
+          </w:tcPr>
+          <w:p>
+            <w:pPr>
+              <w:pStyle w:val="Normal"/>
+              <w:widowControl/>
+              <w:suppressAutoHyphens w:val="true"/>
+              <w:spacing w:lineRule="auto" w:line="240" w:before="0" w:after="0"/>
+              <w:jc w:val="left"/>
+              <w:rPr>
+                <w:rFonts w:ascii="Calibri" w:hAnsi="Calibri" w:eastAsia="Calibri" w:cs=""/>
+                <w:kern w:val="0"/>
+                <w:sz w:val="22"/>
+                <w:szCs w:val="22"/>
+                <w:lang w:val="en-US" w:eastAsia="en-US" w:bidi="ar-SA"/>
+              </w:rPr>
+            </w:pPr>
+            <w:r>
+              <w:rPr>
+                <w:rFonts w:eastAsia="Calibri" w:cs=""/>
+                <w:kern w:val="0"/>
+                <w:sz w:val="22"/>
+                <w:szCs w:val="22"/>
+                <w:lang w:val="en-US" w:eastAsia="en-US" w:bidi="ar-SA"/>
+              </w:rPr>
+              <w:t xml:space="preserve">Week </w:t>
+            </w:r>
+            <w:r>
+              <w:rPr>
+                <w:rFonts w:eastAsia="Calibri" w:cs=""/>
+                <w:kern w:val="0"/>
+                <w:sz w:val="22"/>
+                <w:szCs w:val="22"/>
+                <w:lang w:val="en-US" w:eastAsia="en-US" w:bidi="ar-SA"/>
+              </w:rPr>
+              <w:t>3</w:t>
+            </w:r>
+            <w:r>
+              <w:rPr>
+                <w:rFonts w:eastAsia="Calibri" w:cs=""/>
+                <w:kern w:val="0"/>
+                <w:sz w:val="22"/>
+                <w:szCs w:val="22"/>
+                <w:lang w:val="en-US" w:eastAsia="en-US" w:bidi="ar-SA"/>
+              </w:rPr>
+              <w:t>:</w:t>
+            </w:r>
+          </w:p>
+          <w:p>
+            <w:pPr>
+              <w:pStyle w:val="Normal"/>
+              <w:widowControl/>
+              <w:suppressAutoHyphens w:val="true"/>
+              <w:spacing w:lineRule="auto" w:line="240" w:before="0" w:after="0"/>
+              <w:jc w:val="left"/>
+              <w:rPr>
+                <w:rFonts w:ascii="Calibri" w:hAnsi="Calibri" w:eastAsia="Calibri" w:cs=""/>
+                <w:kern w:val="0"/>
+                <w:sz w:val="22"/>
+                <w:szCs w:val="22"/>
+                <w:lang w:val="en-US" w:eastAsia="en-US" w:bidi="ar-SA"/>
+              </w:rPr>
+            </w:pPr>
+            <w:r>
+              <w:rPr>
+                <w:sz w:val="22"/>
+              </w:rPr>
+              <w:t>09/2</w:t>
+            </w:r>
+            <w:r>
+              <w:rPr>
+                <w:sz w:val="22"/>
+              </w:rPr>
+              <w:t>8</w:t>
+            </w:r>
+            <w:r>
+              <w:rPr>
+                <w:sz w:val="22"/>
+              </w:rPr>
+              <w:t xml:space="preserve">/26- </w:t>
+            </w:r>
+            <w:r>
+              <w:rPr>
+                <w:sz w:val="22"/>
+              </w:rPr>
+              <w:t>10</w:t>
+            </w:r>
+            <w:r>
+              <w:rPr>
+                <w:sz w:val="22"/>
+              </w:rPr>
+              <w:t>/</w:t>
+            </w:r>
+            <w:r>
+              <w:rPr>
+                <w:sz w:val="22"/>
+              </w:rPr>
+              <w:t>04</w:t>
+            </w:r>
+            <w:r>
+              <w:rPr>
+                <w:sz w:val="22"/>
+              </w:rPr>
+              <w:t>/26</w:t>
+            </w:r>
+          </w:p>
+        </w:tc>
+        <w:tc>
+          <w:tcPr>
+            <w:tcW w:w="1772" w:type="dxa"/>
+            <w:tcBorders>
+              <w:top w:val="nil"/>
+            </w:tcBorders>
+          </w:tcPr>
+          <w:p>
+            <w:pPr>
+              <w:pStyle w:val="Normal"/>
+              <w:widowControl/>
+              <w:suppressAutoHyphens w:val="true"/>
+              <w:spacing w:lineRule="auto" w:line="240" w:before="0" w:after="0"/>
+              <w:jc w:val="left"/>
+              <w:rPr>
+                <w:rFonts w:ascii="Calibri" w:hAnsi="Calibri" w:eastAsia="Calibri" w:cs=""/>
+                <w:kern w:val="0"/>
+                <w:sz w:val="22"/>
+                <w:szCs w:val="22"/>
+                <w:lang w:val="en-US" w:eastAsia="en-US" w:bidi="ar-SA"/>
+              </w:rPr>
+            </w:pPr>
+            <w:r>
+              <w:rPr>
+                <w:sz w:val="22"/>
+              </w:rPr>
+              <w:t>Interview with Client</w:t>
+            </w:r>
+          </w:p>
+        </w:tc>
+        <w:tc>
+          <w:tcPr>
+            <w:tcW w:w="1323" w:type="dxa"/>
+            <w:tcBorders>
+              <w:top w:val="nil"/>
+            </w:tcBorders>
+          </w:tcPr>
+          <w:p>
+            <w:pPr>
+              <w:pStyle w:val="Normal"/>
+              <w:widowControl/>
+              <w:suppressAutoHyphens w:val="true"/>
+              <w:spacing w:lineRule="auto" w:line="240" w:before="0" w:after="0"/>
+              <w:jc w:val="left"/>
+              <w:rPr>
+                <w:rFonts w:ascii="Calibri" w:hAnsi="Calibri" w:eastAsia="Calibri" w:cs=""/>
+                <w:kern w:val="0"/>
+                <w:sz w:val="22"/>
+                <w:szCs w:val="22"/>
+                <w:lang w:val="en-US" w:eastAsia="en-US" w:bidi="ar-SA"/>
+              </w:rPr>
+            </w:pPr>
+            <w:r>
+              <w:rPr>
+                <w:sz w:val="22"/>
+              </w:rPr>
+              <w:t>10</w:t>
+            </w:r>
+            <w:r>
+              <w:rPr>
+                <w:sz w:val="22"/>
+              </w:rPr>
+              <w:t>/</w:t>
+            </w:r>
+            <w:r>
+              <w:rPr>
+                <w:sz w:val="22"/>
+              </w:rPr>
+              <w:t>01</w:t>
+            </w:r>
+            <w:r>
+              <w:rPr>
+                <w:sz w:val="22"/>
+              </w:rPr>
+              <w:t>/26</w:t>
+            </w:r>
+          </w:p>
+        </w:tc>
+        <w:tc>
+          <w:tcPr>
+            <w:tcW w:w="1516" w:type="dxa"/>
+            <w:tcBorders>
+              <w:top w:val="nil"/>
+            </w:tcBorders>
+          </w:tcPr>
+          <w:p>
+            <w:pPr>
+              <w:pStyle w:val="Normal"/>
+              <w:widowControl/>
+              <w:suppressAutoHyphens w:val="true"/>
+              <w:spacing w:lineRule="auto" w:line="240" w:before="0" w:after="0"/>
+              <w:jc w:val="left"/>
+              <w:rPr>
+                <w:rFonts w:ascii="Calibri" w:hAnsi="Calibri" w:eastAsia="Calibri" w:cs=""/>
+                <w:kern w:val="0"/>
+                <w:sz w:val="22"/>
+                <w:szCs w:val="22"/>
+                <w:lang w:val="en-US" w:eastAsia="en-US" w:bidi="ar-SA"/>
+              </w:rPr>
+            </w:pPr>
+            <w:r>
+              <w:rPr>
+                <w:rFonts w:eastAsia="Calibri" w:cs=""/>
+                <w:kern w:val="0"/>
+                <w:sz w:val="22"/>
+                <w:szCs w:val="22"/>
+                <w:lang w:val="en-US" w:eastAsia="en-US" w:bidi="ar-SA"/>
+              </w:rPr>
+              <w:t>12:30 am</w:t>
+            </w:r>
+          </w:p>
+        </w:tc>
+        <w:tc>
+          <w:tcPr>
+            <w:tcW w:w="1632" w:type="dxa"/>
+            <w:tcBorders>
+              <w:top w:val="nil"/>
+            </w:tcBorders>
+          </w:tcPr>
+          <w:p>
+            <w:pPr>
+              <w:pStyle w:val="Normal"/>
+              <w:widowControl/>
+              <w:suppressAutoHyphens w:val="true"/>
+              <w:spacing w:lineRule="auto" w:line="240" w:before="0" w:after="0"/>
+              <w:jc w:val="left"/>
+              <w:rPr>
+                <w:rFonts w:ascii="Calibri" w:hAnsi="Calibri" w:eastAsia="Calibri" w:cs=""/>
+                <w:kern w:val="0"/>
+                <w:sz w:val="22"/>
+                <w:szCs w:val="22"/>
+                <w:lang w:val="en-US" w:eastAsia="en-US" w:bidi="ar-SA"/>
+              </w:rPr>
+            </w:pPr>
+            <w:r>
+              <w:rPr>
+                <w:sz w:val="22"/>
+              </w:rPr>
+              <w:t>1:</w:t>
+            </w:r>
+            <w:r>
+              <w:rPr>
+                <w:sz w:val="22"/>
+              </w:rPr>
+              <w:t>00</w:t>
+            </w:r>
+            <w:r>
+              <w:rPr>
+                <w:sz w:val="22"/>
+              </w:rPr>
+              <w:t xml:space="preserve"> pm</w:t>
+            </w:r>
+          </w:p>
+        </w:tc>
+        <w:tc>
+          <w:tcPr>
+            <w:tcW w:w="1514" w:type="dxa"/>
+            <w:tcBorders>
+              <w:top w:val="nil"/>
+            </w:tcBorders>
+          </w:tcPr>
+          <w:p>
+            <w:pPr>
+              <w:pStyle w:val="Normal"/>
+              <w:widowControl/>
+              <w:suppressAutoHyphens w:val="true"/>
+              <w:spacing w:lineRule="auto" w:line="240" w:before="0" w:after="0"/>
+              <w:jc w:val="left"/>
+              <w:rPr>
+                <w:rFonts w:ascii="Calibri" w:hAnsi="Calibri" w:eastAsia="Calibri" w:cs=""/>
+                <w:kern w:val="0"/>
+                <w:sz w:val="22"/>
+                <w:szCs w:val="22"/>
+                <w:lang w:val="en-US" w:eastAsia="en-US" w:bidi="ar-SA"/>
+              </w:rPr>
+            </w:pPr>
+            <w:r>
+              <w:rPr>
+                <w:rFonts w:eastAsia="Calibri" w:cs=""/>
+                <w:kern w:val="0"/>
+                <w:sz w:val="22"/>
+                <w:szCs w:val="22"/>
+                <w:lang w:val="en-US" w:eastAsia="en-US" w:bidi="ar-SA"/>
+              </w:rPr>
+              <w:t>30 min</w:t>
+            </w:r>
+          </w:p>
+        </w:tc>
+      </w:tr>
+      <w:tr>
+        <w:trPr/>
+        <w:tc>
+          <w:tcPr>
+            <w:tcW w:w="1819" w:type="dxa"/>
+            <w:tcBorders>
+              <w:top w:val="nil"/>
+            </w:tcBorders>
+          </w:tcPr>
+          <w:p>
+            <w:pPr>
+              <w:pStyle w:val="Normal"/>
+              <w:widowControl/>
+              <w:suppressAutoHyphens w:val="true"/>
+              <w:spacing w:lineRule="auto" w:line="240" w:before="0" w:after="0"/>
+              <w:jc w:val="left"/>
+              <w:rPr>
+                <w:rFonts w:ascii="Calibri" w:hAnsi="Calibri" w:eastAsia="Calibri" w:cs=""/>
+                <w:kern w:val="0"/>
+                <w:sz w:val="22"/>
+                <w:szCs w:val="22"/>
+                <w:lang w:val="en-US" w:eastAsia="en-US" w:bidi="ar-SA"/>
+              </w:rPr>
+            </w:pPr>
+            <w:r>
+              <w:rPr>
+                <w:rFonts w:eastAsia="Calibri" w:cs=""/>
+                <w:kern w:val="0"/>
+                <w:sz w:val="22"/>
+                <w:szCs w:val="22"/>
+                <w:lang w:val="en-US" w:eastAsia="en-US" w:bidi="ar-SA"/>
+              </w:rPr>
+            </w:r>
+          </w:p>
+        </w:tc>
+        <w:tc>
+          <w:tcPr>
+            <w:tcW w:w="1772" w:type="dxa"/>
+            <w:tcBorders>
+              <w:top w:val="nil"/>
+            </w:tcBorders>
+          </w:tcPr>
+          <w:p>
+            <w:pPr>
+              <w:pStyle w:val="Normal"/>
+              <w:widowControl/>
+              <w:suppressAutoHyphens w:val="true"/>
+              <w:spacing w:lineRule="auto" w:line="240" w:before="0" w:after="0"/>
+              <w:jc w:val="left"/>
+              <w:rPr>
+                <w:rFonts w:ascii="Calibri" w:hAnsi="Calibri" w:eastAsia="Calibri" w:cs=""/>
+                <w:kern w:val="0"/>
+                <w:sz w:val="22"/>
+                <w:szCs w:val="22"/>
+                <w:lang w:val="en-US" w:eastAsia="en-US" w:bidi="ar-SA"/>
+              </w:rPr>
+            </w:pPr>
+            <w:r>
+              <w:rPr>
+                <w:rFonts w:eastAsia="Calibri" w:cs=""/>
+                <w:kern w:val="0"/>
+                <w:sz w:val="22"/>
+                <w:szCs w:val="22"/>
+                <w:lang w:val="en-US" w:eastAsia="en-US" w:bidi="ar-SA"/>
+              </w:rPr>
+            </w:r>
+          </w:p>
+        </w:tc>
+        <w:tc>
+          <w:tcPr>
+            <w:tcW w:w="1323" w:type="dxa"/>
+            <w:tcBorders>
+              <w:top w:val="nil"/>
+            </w:tcBorders>
+          </w:tcPr>
+          <w:p>
+            <w:pPr>
+              <w:pStyle w:val="Normal"/>
+              <w:widowControl/>
+              <w:suppressAutoHyphens w:val="true"/>
+              <w:spacing w:lineRule="auto" w:line="240" w:before="0" w:after="0"/>
+              <w:jc w:val="left"/>
+              <w:rPr>
+                <w:rFonts w:ascii="Calibri" w:hAnsi="Calibri" w:eastAsia="Calibri" w:cs=""/>
+                <w:kern w:val="0"/>
+                <w:sz w:val="22"/>
+                <w:szCs w:val="22"/>
+                <w:lang w:val="en-US" w:eastAsia="en-US" w:bidi="ar-SA"/>
+              </w:rPr>
+            </w:pPr>
+            <w:r>
+              <w:rPr>
+                <w:rFonts w:eastAsia="Calibri" w:cs=""/>
+                <w:kern w:val="0"/>
+                <w:sz w:val="22"/>
+                <w:szCs w:val="22"/>
+                <w:lang w:val="en-US" w:eastAsia="en-US" w:bidi="ar-SA"/>
+              </w:rPr>
+            </w:r>
+          </w:p>
+        </w:tc>
+        <w:tc>
+          <w:tcPr>
+            <w:tcW w:w="1516" w:type="dxa"/>
+            <w:tcBorders>
+              <w:top w:val="nil"/>
+            </w:tcBorders>
+          </w:tcPr>
+          <w:p>
+            <w:pPr>
+              <w:pStyle w:val="Normal"/>
+              <w:widowControl/>
+              <w:suppressAutoHyphens w:val="true"/>
+              <w:spacing w:lineRule="auto" w:line="240" w:before="0" w:after="0"/>
+              <w:jc w:val="left"/>
+              <w:rPr>
+                <w:rFonts w:ascii="Calibri" w:hAnsi="Calibri" w:eastAsia="Calibri" w:cs=""/>
+                <w:kern w:val="0"/>
+                <w:sz w:val="22"/>
+                <w:szCs w:val="22"/>
+                <w:lang w:val="en-US" w:eastAsia="en-US" w:bidi="ar-SA"/>
+              </w:rPr>
+            </w:pPr>
+            <w:r>
+              <w:rPr>
+                <w:rFonts w:eastAsia="Calibri" w:cs=""/>
+                <w:kern w:val="0"/>
+                <w:sz w:val="22"/>
+                <w:szCs w:val="22"/>
+                <w:lang w:val="en-US" w:eastAsia="en-US" w:bidi="ar-SA"/>
+              </w:rPr>
+            </w:r>
+          </w:p>
+        </w:tc>
+        <w:tc>
+          <w:tcPr>
+            <w:tcW w:w="1632" w:type="dxa"/>
+            <w:tcBorders>
+              <w:top w:val="nil"/>
+            </w:tcBorders>
+          </w:tcPr>
+          <w:p>
+            <w:pPr>
+              <w:pStyle w:val="Normal"/>
+              <w:widowControl/>
+              <w:suppressAutoHyphens w:val="true"/>
+              <w:spacing w:lineRule="auto" w:line="240" w:before="0" w:after="0"/>
+              <w:jc w:val="left"/>
+              <w:rPr>
+                <w:rFonts w:ascii="Calibri" w:hAnsi="Calibri" w:eastAsia="Calibri" w:cs=""/>
+                <w:kern w:val="0"/>
+                <w:sz w:val="22"/>
+                <w:szCs w:val="22"/>
+                <w:lang w:val="en-US" w:eastAsia="en-US" w:bidi="ar-SA"/>
+              </w:rPr>
+            </w:pPr>
+            <w:r>
+              <w:rPr>
+                <w:rFonts w:eastAsia="Calibri" w:cs=""/>
+                <w:kern w:val="0"/>
+                <w:sz w:val="22"/>
+                <w:szCs w:val="22"/>
+                <w:lang w:val="en-US" w:eastAsia="en-US" w:bidi="ar-SA"/>
+              </w:rPr>
+            </w:r>
+          </w:p>
+        </w:tc>
+        <w:tc>
+          <w:tcPr>
+            <w:tcW w:w="1514" w:type="dxa"/>
+            <w:tcBorders>
+              <w:top w:val="nil"/>
+            </w:tcBorders>
+          </w:tcPr>
+          <w:p>
+            <w:pPr>
+              <w:pStyle w:val="Normal"/>
+              <w:widowControl/>
+              <w:suppressAutoHyphens w:val="true"/>
+              <w:spacing w:lineRule="auto" w:line="240" w:before="0" w:after="0"/>
+              <w:jc w:val="left"/>
+              <w:rPr>
+                <w:rFonts w:ascii="Calibri" w:hAnsi="Calibri" w:eastAsia="Calibri" w:cs=""/>
+                <w:kern w:val="0"/>
+                <w:sz w:val="22"/>
+                <w:szCs w:val="22"/>
+                <w:lang w:val="en-US" w:eastAsia="en-US" w:bidi="ar-SA"/>
+              </w:rPr>
+            </w:pPr>
+            <w:r>
+              <w:rPr>
+                <w:rFonts w:eastAsia="Calibri" w:cs=""/>
+                <w:kern w:val="0"/>
+                <w:sz w:val="22"/>
+                <w:szCs w:val="22"/>
+                <w:lang w:val="en-US" w:eastAsia="en-US" w:bidi="ar-SA"/>
+              </w:rPr>
             </w:r>
           </w:p>
         </w:tc>
@@ -2908,6 +3322,29 @@
       <w:rFonts w:cs="Arial"/>
     </w:rPr>
   </w:style>
+  <w:style w:type="paragraph" w:styleId="user2">
+    <w:name w:val="Вміст таблиці (user)"/>
+    <w:basedOn w:val="Normal"/>
+    <w:qFormat/>
+    <w:pPr>
+      <w:widowControl w:val="false"/>
+      <w:suppressLineNumbers/>
+    </w:pPr>
+    <w:rPr/>
+  </w:style>
+  <w:style w:type="paragraph" w:styleId="user3">
+    <w:name w:val="Заголовок таблиці (user)"/>
+    <w:basedOn w:val="user2"/>
+    <w:qFormat/>
+    <w:pPr>
+      <w:suppressLineNumbers/>
+      <w:jc w:val="center"/>
+    </w:pPr>
+    <w:rPr>
+      <w:b/>
+      <w:bCs/>
+    </w:rPr>
+  </w:style>
   <w:style w:type="paragraph" w:styleId="Style16">
     <w:name w:val="Вміст таблиці"/>
     <w:basedOn w:val="Normal"/>
@@ -2931,31 +3368,8 @@
       <w:bCs/>
     </w:rPr>
   </w:style>
-  <w:style w:type="paragraph" w:styleId="user2">
-    <w:name w:val="Вміст таблиці (user)"/>
-    <w:basedOn w:val="Normal"/>
-    <w:qFormat/>
-    <w:pPr>
-      <w:widowControl w:val="false"/>
-      <w:suppressLineNumbers/>
-    </w:pPr>
-    <w:rPr/>
-  </w:style>
-  <w:style w:type="paragraph" w:styleId="user3">
-    <w:name w:val="Заголовок таблиці (user)"/>
-    <w:basedOn w:val="user2"/>
-    <w:qFormat/>
-    <w:pPr>
-      <w:suppressLineNumbers/>
-      <w:jc w:val="center"/>
-    </w:pPr>
-    <w:rPr>
-      <w:b/>
-      <w:bCs/>
-    </w:rPr>
-  </w:style>
-  <w:style w:type="numbering" w:styleId="Style18" w:default="1">
-    <w:name w:val="Без маркерів"/>
+  <w:style w:type="numbering" w:styleId="user4" w:default="1">
+    <w:name w:val="Без маркерів (user)"/>
     <w:uiPriority w:val="99"/>
     <w:semiHidden/>
     <w:unhideWhenUsed/>

</xml_diff>

<commit_message>
Time Log Ovcharenko 04.20.2026
</commit_message>
<xml_diff>
--- a/Reports, Logs & Evaluations/Time Logs/Ovcharenko/Time Log.docx
+++ b/Reports, Logs & Evaluations/Time Logs/Ovcharenko/Time Log.docx
@@ -2316,85 +2316,29 @@
                 <w:szCs w:val="22"/>
                 <w:lang w:val="en-US" w:eastAsia="en-US" w:bidi="ar-SA"/>
               </w:rPr>
-              <w:t xml:space="preserve">Week </w:t>
-            </w:r>
-            <w:r>
-              <w:rPr>
-                <w:rFonts w:eastAsia="Calibri" w:cs=""/>
-                <w:kern w:val="0"/>
-                <w:sz w:val="22"/>
-                <w:szCs w:val="22"/>
-                <w:lang w:val="en-US" w:eastAsia="en-US" w:bidi="ar-SA"/>
-              </w:rPr>
-              <w:t>3</w:t>
-            </w:r>
-            <w:r>
-              <w:rPr>
-                <w:rFonts w:eastAsia="Calibri" w:cs=""/>
-                <w:kern w:val="0"/>
-                <w:sz w:val="22"/>
-                <w:szCs w:val="22"/>
-                <w:lang w:val="en-US" w:eastAsia="en-US" w:bidi="ar-SA"/>
-              </w:rPr>
-              <w:t>:</w:t>
-            </w:r>
-          </w:p>
-          <w:p>
-            <w:pPr>
-              <w:pStyle w:val="Normal"/>
-              <w:widowControl/>
-              <w:suppressAutoHyphens w:val="true"/>
-              <w:spacing w:lineRule="auto" w:line="240" w:before="0" w:after="0"/>
-              <w:jc w:val="left"/>
-              <w:rPr>
-                <w:rFonts w:ascii="Calibri" w:hAnsi="Calibri" w:eastAsia="Calibri" w:cs=""/>
-                <w:kern w:val="0"/>
-                <w:sz w:val="22"/>
-                <w:szCs w:val="22"/>
-                <w:lang w:val="en-US" w:eastAsia="en-US" w:bidi="ar-SA"/>
-              </w:rPr>
-            </w:pPr>
-            <w:r>
-              <w:rPr>
-                <w:sz w:val="22"/>
-              </w:rPr>
-              <w:t>09/2</w:t>
-            </w:r>
-            <w:r>
-              <w:rPr>
-                <w:sz w:val="22"/>
-              </w:rPr>
-              <w:t>8</w:t>
-            </w:r>
-            <w:r>
-              <w:rPr>
-                <w:sz w:val="22"/>
-              </w:rPr>
-              <w:t xml:space="preserve">/26- </w:t>
-            </w:r>
-            <w:r>
-              <w:rPr>
-                <w:sz w:val="22"/>
-              </w:rPr>
-              <w:t>10</w:t>
-            </w:r>
-            <w:r>
-              <w:rPr>
-                <w:sz w:val="22"/>
-              </w:rPr>
-              <w:t>/</w:t>
-            </w:r>
-            <w:r>
-              <w:rPr>
-                <w:sz w:val="22"/>
-              </w:rPr>
-              <w:t>04</w:t>
-            </w:r>
-            <w:r>
-              <w:rPr>
-                <w:sz w:val="22"/>
-              </w:rPr>
-              <w:t>/26</w:t>
+              <w:t>Week 3:</w:t>
+            </w:r>
+          </w:p>
+          <w:p>
+            <w:pPr>
+              <w:pStyle w:val="Normal"/>
+              <w:widowControl/>
+              <w:suppressAutoHyphens w:val="true"/>
+              <w:spacing w:lineRule="auto" w:line="240" w:before="0" w:after="0"/>
+              <w:jc w:val="left"/>
+              <w:rPr>
+                <w:rFonts w:ascii="Calibri" w:hAnsi="Calibri" w:eastAsia="Calibri" w:cs=""/>
+                <w:kern w:val="0"/>
+                <w:sz w:val="22"/>
+                <w:szCs w:val="22"/>
+                <w:lang w:val="en-US" w:eastAsia="en-US" w:bidi="ar-SA"/>
+              </w:rPr>
+            </w:pPr>
+            <w:r>
+              <w:rPr>
+                <w:sz w:val="22"/>
+              </w:rPr>
+              <w:t>09/28/26- 10/04/26</w:t>
             </w:r>
           </w:p>
         </w:tc>
@@ -2454,25 +2398,7 @@
               <w:rPr>
                 <w:sz w:val="22"/>
               </w:rPr>
-              <w:t>10</w:t>
-            </w:r>
-            <w:r>
-              <w:rPr>
-                <w:sz w:val="22"/>
-              </w:rPr>
-              <w:t>/</w:t>
-            </w:r>
-            <w:r>
-              <w:rPr>
-                <w:sz w:val="22"/>
-              </w:rPr>
-              <w:t>01</w:t>
-            </w:r>
-            <w:r>
-              <w:rPr>
-                <w:sz w:val="22"/>
-              </w:rPr>
-              <w:t>/26</w:t>
+              <w:t>10/01/26</w:t>
             </w:r>
           </w:p>
         </w:tc>
@@ -2536,19 +2462,7 @@
               <w:rPr>
                 <w:sz w:val="22"/>
               </w:rPr>
-              <w:t>1:</w:t>
-            </w:r>
-            <w:r>
-              <w:rPr>
-                <w:sz w:val="22"/>
-              </w:rPr>
-              <w:t>00</w:t>
-            </w:r>
-            <w:r>
-              <w:rPr>
-                <w:sz w:val="22"/>
-              </w:rPr>
-              <w:t xml:space="preserve"> pm</w:t>
+              <w:t>1:00 pm</w:t>
             </w:r>
           </w:p>
         </w:tc>
@@ -2652,6 +2566,7 @@
                 <w:szCs w:val="22"/>
                 <w:lang w:val="en-US" w:eastAsia="en-US" w:bidi="ar-SA"/>
               </w:rPr>
+              <w:t>Implementing Client Suggestions</w:t>
             </w:r>
           </w:p>
         </w:tc>
@@ -2679,12 +2594,21 @@
             </w:pPr>
             <w:r>
               <w:rPr>
-                <w:rFonts w:eastAsia="Calibri" w:cs=""/>
-                <w:kern w:val="0"/>
-                <w:sz w:val="22"/>
-                <w:szCs w:val="22"/>
-                <w:lang w:val="en-US" w:eastAsia="en-US" w:bidi="ar-SA"/>
-              </w:rPr>
+                <w:sz w:val="22"/>
+              </w:rPr>
+              <w:t>10/0</w:t>
+            </w:r>
+            <w:r>
+              <w:rPr>
+                <w:sz w:val="22"/>
+              </w:rPr>
+              <w:t>2</w:t>
+            </w:r>
+            <w:r>
+              <w:rPr>
+                <w:sz w:val="22"/>
+              </w:rPr>
+              <w:t>/26</w:t>
             </w:r>
           </w:p>
         </w:tc>
@@ -2718,6 +2642,7 @@
                 <w:szCs w:val="22"/>
                 <w:lang w:val="en-US" w:eastAsia="en-US" w:bidi="ar-SA"/>
               </w:rPr>
+              <w:t>1:00 pm</w:t>
             </w:r>
           </w:p>
         </w:tc>
@@ -2745,12 +2670,21 @@
             </w:pPr>
             <w:r>
               <w:rPr>
-                <w:rFonts w:eastAsia="Calibri" w:cs=""/>
-                <w:kern w:val="0"/>
-                <w:sz w:val="22"/>
-                <w:szCs w:val="22"/>
-                <w:lang w:val="en-US" w:eastAsia="en-US" w:bidi="ar-SA"/>
-              </w:rPr>
+                <w:sz w:val="22"/>
+              </w:rPr>
+              <w:t>4:</w:t>
+            </w:r>
+            <w:r>
+              <w:rPr>
+                <w:sz w:val="22"/>
+              </w:rPr>
+              <w:t>00</w:t>
+            </w:r>
+            <w:r>
+              <w:rPr>
+                <w:sz w:val="22"/>
+              </w:rPr>
+              <w:t xml:space="preserve"> pm</w:t>
             </w:r>
           </w:p>
         </w:tc>
@@ -2784,6 +2718,663 @@
                 <w:szCs w:val="22"/>
                 <w:lang w:val="en-US" w:eastAsia="en-US" w:bidi="ar-SA"/>
               </w:rPr>
+              <w:t>180 min</w:t>
+            </w:r>
+          </w:p>
+        </w:tc>
+      </w:tr>
+      <w:tr>
+        <w:trPr>
+          <w:trHeight w:val="231" w:hRule="atLeast"/>
+        </w:trPr>
+        <w:tc>
+          <w:tcPr>
+            <w:tcW w:w="1819" w:type="dxa"/>
+            <w:tcBorders>
+              <w:top w:val="nil"/>
+            </w:tcBorders>
+          </w:tcPr>
+          <w:p>
+            <w:pPr>
+              <w:pStyle w:val="Normal"/>
+              <w:widowControl/>
+              <w:suppressAutoHyphens w:val="true"/>
+              <w:spacing w:lineRule="auto" w:line="240" w:before="0" w:after="0"/>
+              <w:jc w:val="left"/>
+              <w:rPr>
+                <w:rFonts w:ascii="Calibri" w:hAnsi="Calibri" w:eastAsia="Calibri" w:cs=""/>
+                <w:kern w:val="0"/>
+                <w:sz w:val="22"/>
+                <w:szCs w:val="22"/>
+                <w:lang w:val="en-US" w:eastAsia="en-US" w:bidi="ar-SA"/>
+              </w:rPr>
+            </w:pPr>
+            <w:r>
+              <w:rPr>
+                <w:rFonts w:eastAsia="Calibri" w:cs=""/>
+                <w:kern w:val="0"/>
+                <w:sz w:val="22"/>
+                <w:szCs w:val="22"/>
+                <w:lang w:val="en-US" w:eastAsia="en-US" w:bidi="ar-SA"/>
+              </w:rPr>
+            </w:r>
+          </w:p>
+        </w:tc>
+        <w:tc>
+          <w:tcPr>
+            <w:tcW w:w="1772" w:type="dxa"/>
+            <w:tcBorders>
+              <w:top w:val="nil"/>
+            </w:tcBorders>
+          </w:tcPr>
+          <w:p>
+            <w:pPr>
+              <w:pStyle w:val="Normal"/>
+              <w:widowControl/>
+              <w:suppressAutoHyphens w:val="true"/>
+              <w:spacing w:lineRule="auto" w:line="240" w:before="0" w:after="0"/>
+              <w:jc w:val="left"/>
+              <w:rPr>
+                <w:rFonts w:ascii="Calibri" w:hAnsi="Calibri" w:eastAsia="Calibri" w:cs=""/>
+                <w:kern w:val="0"/>
+                <w:sz w:val="22"/>
+                <w:szCs w:val="22"/>
+                <w:lang w:val="en-US" w:eastAsia="en-US" w:bidi="ar-SA"/>
+              </w:rPr>
+            </w:pPr>
+            <w:r>
+              <w:rPr>
+                <w:rFonts w:eastAsia="Calibri" w:cs=""/>
+                <w:kern w:val="0"/>
+                <w:sz w:val="22"/>
+                <w:szCs w:val="22"/>
+                <w:lang w:val="en-US" w:eastAsia="en-US" w:bidi="ar-SA"/>
+              </w:rPr>
+              <w:t>Editing User’s Guide</w:t>
+            </w:r>
+          </w:p>
+        </w:tc>
+        <w:tc>
+          <w:tcPr>
+            <w:tcW w:w="1323" w:type="dxa"/>
+            <w:tcBorders>
+              <w:top w:val="nil"/>
+            </w:tcBorders>
+          </w:tcPr>
+          <w:p>
+            <w:pPr>
+              <w:pStyle w:val="Normal"/>
+              <w:widowControl/>
+              <w:suppressAutoHyphens w:val="true"/>
+              <w:spacing w:lineRule="auto" w:line="240" w:before="0" w:after="0"/>
+              <w:jc w:val="left"/>
+              <w:rPr>
+                <w:rFonts w:ascii="Calibri" w:hAnsi="Calibri" w:eastAsia="Calibri" w:cs=""/>
+                <w:kern w:val="0"/>
+                <w:sz w:val="22"/>
+                <w:szCs w:val="22"/>
+                <w:lang w:val="en-US" w:eastAsia="en-US" w:bidi="ar-SA"/>
+              </w:rPr>
+            </w:pPr>
+            <w:r>
+              <w:rPr>
+                <w:sz w:val="22"/>
+              </w:rPr>
+              <w:t>10/0</w:t>
+            </w:r>
+            <w:r>
+              <w:rPr>
+                <w:sz w:val="22"/>
+              </w:rPr>
+              <w:t>2</w:t>
+            </w:r>
+            <w:r>
+              <w:rPr>
+                <w:sz w:val="22"/>
+              </w:rPr>
+              <w:t>/26</w:t>
+            </w:r>
+          </w:p>
+        </w:tc>
+        <w:tc>
+          <w:tcPr>
+            <w:tcW w:w="1516" w:type="dxa"/>
+            <w:tcBorders>
+              <w:top w:val="nil"/>
+            </w:tcBorders>
+          </w:tcPr>
+          <w:p>
+            <w:pPr>
+              <w:pStyle w:val="Normal"/>
+              <w:widowControl/>
+              <w:suppressAutoHyphens w:val="true"/>
+              <w:spacing w:lineRule="auto" w:line="240" w:before="0" w:after="0"/>
+              <w:jc w:val="left"/>
+              <w:rPr>
+                <w:rFonts w:ascii="Calibri" w:hAnsi="Calibri" w:eastAsia="Calibri" w:cs=""/>
+                <w:kern w:val="0"/>
+                <w:sz w:val="22"/>
+                <w:szCs w:val="22"/>
+                <w:lang w:val="en-US" w:eastAsia="en-US" w:bidi="ar-SA"/>
+              </w:rPr>
+            </w:pPr>
+            <w:r>
+              <w:rPr>
+                <w:sz w:val="22"/>
+              </w:rPr>
+              <w:t>4:</w:t>
+            </w:r>
+            <w:r>
+              <w:rPr>
+                <w:sz w:val="22"/>
+              </w:rPr>
+              <w:t>30</w:t>
+            </w:r>
+            <w:r>
+              <w:rPr>
+                <w:sz w:val="22"/>
+              </w:rPr>
+              <w:t xml:space="preserve"> pm</w:t>
+            </w:r>
+          </w:p>
+        </w:tc>
+        <w:tc>
+          <w:tcPr>
+            <w:tcW w:w="1632" w:type="dxa"/>
+            <w:tcBorders>
+              <w:top w:val="nil"/>
+            </w:tcBorders>
+          </w:tcPr>
+          <w:p>
+            <w:pPr>
+              <w:pStyle w:val="Normal"/>
+              <w:widowControl/>
+              <w:suppressAutoHyphens w:val="true"/>
+              <w:spacing w:lineRule="auto" w:line="240" w:before="0" w:after="0"/>
+              <w:jc w:val="left"/>
+              <w:rPr>
+                <w:rFonts w:ascii="Calibri" w:hAnsi="Calibri" w:eastAsia="Calibri" w:cs=""/>
+                <w:kern w:val="0"/>
+                <w:sz w:val="22"/>
+                <w:szCs w:val="22"/>
+                <w:lang w:val="en-US" w:eastAsia="en-US" w:bidi="ar-SA"/>
+              </w:rPr>
+            </w:pPr>
+            <w:r>
+              <w:rPr>
+                <w:rFonts w:eastAsia="Calibri" w:cs=""/>
+                <w:kern w:val="0"/>
+                <w:sz w:val="22"/>
+                <w:szCs w:val="22"/>
+                <w:lang w:val="en-US" w:eastAsia="en-US" w:bidi="ar-SA"/>
+              </w:rPr>
+              <w:t>6:30 pm</w:t>
+            </w:r>
+          </w:p>
+        </w:tc>
+        <w:tc>
+          <w:tcPr>
+            <w:tcW w:w="1514" w:type="dxa"/>
+            <w:tcBorders>
+              <w:top w:val="nil"/>
+            </w:tcBorders>
+          </w:tcPr>
+          <w:p>
+            <w:pPr>
+              <w:pStyle w:val="Normal"/>
+              <w:widowControl/>
+              <w:suppressAutoHyphens w:val="true"/>
+              <w:spacing w:lineRule="auto" w:line="240" w:before="0" w:after="0"/>
+              <w:jc w:val="left"/>
+              <w:rPr>
+                <w:rFonts w:ascii="Calibri" w:hAnsi="Calibri" w:eastAsia="Calibri" w:cs=""/>
+                <w:kern w:val="0"/>
+                <w:sz w:val="22"/>
+                <w:szCs w:val="22"/>
+                <w:lang w:val="en-US" w:eastAsia="en-US" w:bidi="ar-SA"/>
+              </w:rPr>
+            </w:pPr>
+            <w:r>
+              <w:rPr>
+                <w:rFonts w:eastAsia="Calibri" w:cs=""/>
+                <w:kern w:val="0"/>
+                <w:sz w:val="22"/>
+                <w:szCs w:val="22"/>
+                <w:lang w:val="en-US" w:eastAsia="en-US" w:bidi="ar-SA"/>
+              </w:rPr>
+              <w:t>120 min</w:t>
+            </w:r>
+          </w:p>
+        </w:tc>
+      </w:tr>
+      <w:tr>
+        <w:trPr>
+          <w:trHeight w:val="231" w:hRule="atLeast"/>
+        </w:trPr>
+        <w:tc>
+          <w:tcPr>
+            <w:tcW w:w="1819" w:type="dxa"/>
+            <w:tcBorders>
+              <w:top w:val="nil"/>
+            </w:tcBorders>
+          </w:tcPr>
+          <w:p>
+            <w:pPr>
+              <w:pStyle w:val="Normal"/>
+              <w:widowControl/>
+              <w:suppressAutoHyphens w:val="true"/>
+              <w:spacing w:lineRule="auto" w:line="240" w:before="0" w:after="0"/>
+              <w:jc w:val="left"/>
+              <w:rPr>
+                <w:rFonts w:ascii="Calibri" w:hAnsi="Calibri" w:eastAsia="Calibri" w:cs=""/>
+                <w:kern w:val="0"/>
+                <w:sz w:val="22"/>
+                <w:szCs w:val="22"/>
+                <w:lang w:val="en-US" w:eastAsia="en-US" w:bidi="ar-SA"/>
+              </w:rPr>
+            </w:pPr>
+            <w:r>
+              <w:rPr>
+                <w:rFonts w:eastAsia="Calibri" w:cs=""/>
+                <w:kern w:val="0"/>
+                <w:sz w:val="22"/>
+                <w:szCs w:val="22"/>
+                <w:lang w:val="en-US" w:eastAsia="en-US" w:bidi="ar-SA"/>
+              </w:rPr>
+            </w:r>
+          </w:p>
+        </w:tc>
+        <w:tc>
+          <w:tcPr>
+            <w:tcW w:w="1772" w:type="dxa"/>
+            <w:tcBorders>
+              <w:top w:val="nil"/>
+            </w:tcBorders>
+          </w:tcPr>
+          <w:p>
+            <w:pPr>
+              <w:pStyle w:val="Normal"/>
+              <w:widowControl/>
+              <w:suppressAutoHyphens w:val="true"/>
+              <w:spacing w:lineRule="auto" w:line="240" w:before="0" w:after="0"/>
+              <w:jc w:val="left"/>
+              <w:rPr>
+                <w:rFonts w:ascii="Calibri" w:hAnsi="Calibri" w:eastAsia="Calibri" w:cs=""/>
+                <w:kern w:val="0"/>
+                <w:sz w:val="22"/>
+                <w:szCs w:val="22"/>
+                <w:lang w:val="en-US" w:eastAsia="en-US" w:bidi="ar-SA"/>
+              </w:rPr>
+            </w:pPr>
+            <w:r>
+              <w:rPr>
+                <w:rFonts w:eastAsia="Calibri" w:cs=""/>
+                <w:kern w:val="0"/>
+                <w:sz w:val="22"/>
+                <w:szCs w:val="22"/>
+                <w:lang w:val="en-US" w:eastAsia="en-US" w:bidi="ar-SA"/>
+              </w:rPr>
+              <w:t>Editing Requirements</w:t>
+            </w:r>
+          </w:p>
+        </w:tc>
+        <w:tc>
+          <w:tcPr>
+            <w:tcW w:w="1323" w:type="dxa"/>
+            <w:tcBorders>
+              <w:top w:val="nil"/>
+            </w:tcBorders>
+          </w:tcPr>
+          <w:p>
+            <w:pPr>
+              <w:pStyle w:val="Normal"/>
+              <w:widowControl/>
+              <w:suppressAutoHyphens w:val="true"/>
+              <w:spacing w:lineRule="auto" w:line="240" w:before="0" w:after="0"/>
+              <w:jc w:val="left"/>
+              <w:rPr>
+                <w:rFonts w:ascii="Calibri" w:hAnsi="Calibri" w:eastAsia="Calibri" w:cs=""/>
+                <w:kern w:val="0"/>
+                <w:sz w:val="22"/>
+                <w:szCs w:val="22"/>
+                <w:lang w:val="en-US" w:eastAsia="en-US" w:bidi="ar-SA"/>
+              </w:rPr>
+            </w:pPr>
+            <w:r>
+              <w:rPr>
+                <w:sz w:val="22"/>
+              </w:rPr>
+              <w:t>10/0</w:t>
+            </w:r>
+            <w:r>
+              <w:rPr>
+                <w:sz w:val="22"/>
+              </w:rPr>
+              <w:t>3</w:t>
+            </w:r>
+            <w:r>
+              <w:rPr>
+                <w:sz w:val="22"/>
+              </w:rPr>
+              <w:t>/26</w:t>
+            </w:r>
+          </w:p>
+        </w:tc>
+        <w:tc>
+          <w:tcPr>
+            <w:tcW w:w="1516" w:type="dxa"/>
+            <w:tcBorders>
+              <w:top w:val="nil"/>
+            </w:tcBorders>
+          </w:tcPr>
+          <w:p>
+            <w:pPr>
+              <w:pStyle w:val="Normal"/>
+              <w:widowControl/>
+              <w:suppressAutoHyphens w:val="true"/>
+              <w:spacing w:lineRule="auto" w:line="240" w:before="0" w:after="0"/>
+              <w:jc w:val="left"/>
+              <w:rPr>
+                <w:rFonts w:ascii="Calibri" w:hAnsi="Calibri" w:eastAsia="Calibri" w:cs=""/>
+                <w:kern w:val="0"/>
+                <w:sz w:val="22"/>
+                <w:szCs w:val="22"/>
+                <w:lang w:val="en-US" w:eastAsia="en-US" w:bidi="ar-SA"/>
+              </w:rPr>
+            </w:pPr>
+            <w:r>
+              <w:rPr>
+                <w:sz w:val="22"/>
+              </w:rPr>
+              <w:t>1:00 pm</w:t>
+            </w:r>
+          </w:p>
+        </w:tc>
+        <w:tc>
+          <w:tcPr>
+            <w:tcW w:w="1632" w:type="dxa"/>
+            <w:tcBorders>
+              <w:top w:val="nil"/>
+            </w:tcBorders>
+          </w:tcPr>
+          <w:p>
+            <w:pPr>
+              <w:pStyle w:val="Normal"/>
+              <w:widowControl/>
+              <w:suppressAutoHyphens w:val="true"/>
+              <w:spacing w:lineRule="auto" w:line="240" w:before="0" w:after="0"/>
+              <w:jc w:val="left"/>
+              <w:rPr>
+                <w:rFonts w:ascii="Calibri" w:hAnsi="Calibri" w:eastAsia="Calibri" w:cs=""/>
+                <w:kern w:val="0"/>
+                <w:sz w:val="22"/>
+                <w:szCs w:val="22"/>
+                <w:lang w:val="en-US" w:eastAsia="en-US" w:bidi="ar-SA"/>
+              </w:rPr>
+            </w:pPr>
+            <w:r>
+              <w:rPr>
+                <w:sz w:val="22"/>
+              </w:rPr>
+              <w:t>2:</w:t>
+            </w:r>
+            <w:r>
+              <w:rPr>
+                <w:sz w:val="22"/>
+              </w:rPr>
+              <w:t>15</w:t>
+            </w:r>
+            <w:r>
+              <w:rPr>
+                <w:sz w:val="22"/>
+              </w:rPr>
+              <w:t xml:space="preserve"> pm</w:t>
+            </w:r>
+          </w:p>
+        </w:tc>
+        <w:tc>
+          <w:tcPr>
+            <w:tcW w:w="1514" w:type="dxa"/>
+            <w:tcBorders>
+              <w:top w:val="nil"/>
+            </w:tcBorders>
+          </w:tcPr>
+          <w:p>
+            <w:pPr>
+              <w:pStyle w:val="Normal"/>
+              <w:widowControl/>
+              <w:suppressAutoHyphens w:val="true"/>
+              <w:spacing w:lineRule="auto" w:line="240" w:before="0" w:after="0"/>
+              <w:jc w:val="left"/>
+              <w:rPr>
+                <w:rFonts w:ascii="Calibri" w:hAnsi="Calibri" w:eastAsia="Calibri" w:cs=""/>
+                <w:kern w:val="0"/>
+                <w:sz w:val="22"/>
+                <w:szCs w:val="22"/>
+                <w:lang w:val="en-US" w:eastAsia="en-US" w:bidi="ar-SA"/>
+              </w:rPr>
+            </w:pPr>
+            <w:r>
+              <w:rPr>
+                <w:rFonts w:eastAsia="Calibri" w:cs=""/>
+                <w:kern w:val="0"/>
+                <w:sz w:val="22"/>
+                <w:szCs w:val="22"/>
+                <w:lang w:val="en-US" w:eastAsia="en-US" w:bidi="ar-SA"/>
+              </w:rPr>
+              <w:t>75 min</w:t>
+            </w:r>
+          </w:p>
+        </w:tc>
+      </w:tr>
+      <w:tr>
+        <w:trPr>
+          <w:trHeight w:val="231" w:hRule="atLeast"/>
+        </w:trPr>
+        <w:tc>
+          <w:tcPr>
+            <w:tcW w:w="1819" w:type="dxa"/>
+            <w:tcBorders>
+              <w:top w:val="nil"/>
+            </w:tcBorders>
+          </w:tcPr>
+          <w:p>
+            <w:pPr>
+              <w:pStyle w:val="Normal"/>
+              <w:widowControl/>
+              <w:suppressAutoHyphens w:val="true"/>
+              <w:spacing w:lineRule="auto" w:line="240" w:before="0" w:after="0"/>
+              <w:jc w:val="left"/>
+              <w:rPr>
+                <w:rFonts w:ascii="Calibri" w:hAnsi="Calibri" w:eastAsia="Calibri" w:cs=""/>
+                <w:kern w:val="0"/>
+                <w:sz w:val="22"/>
+                <w:szCs w:val="22"/>
+                <w:lang w:val="en-US" w:eastAsia="en-US" w:bidi="ar-SA"/>
+              </w:rPr>
+            </w:pPr>
+            <w:r>
+              <w:rPr>
+                <w:rFonts w:eastAsia="Calibri" w:cs=""/>
+                <w:kern w:val="0"/>
+                <w:sz w:val="22"/>
+                <w:szCs w:val="22"/>
+                <w:lang w:val="en-US" w:eastAsia="en-US" w:bidi="ar-SA"/>
+              </w:rPr>
+            </w:r>
+          </w:p>
+        </w:tc>
+        <w:tc>
+          <w:tcPr>
+            <w:tcW w:w="1772" w:type="dxa"/>
+            <w:tcBorders>
+              <w:top w:val="nil"/>
+            </w:tcBorders>
+          </w:tcPr>
+          <w:p>
+            <w:pPr>
+              <w:pStyle w:val="Normal"/>
+              <w:widowControl/>
+              <w:suppressAutoHyphens w:val="true"/>
+              <w:spacing w:lineRule="auto" w:line="240" w:before="0" w:after="0"/>
+              <w:jc w:val="left"/>
+              <w:rPr>
+                <w:rFonts w:ascii="Calibri" w:hAnsi="Calibri" w:eastAsia="Calibri" w:cs=""/>
+                <w:kern w:val="0"/>
+                <w:sz w:val="22"/>
+                <w:szCs w:val="22"/>
+                <w:lang w:val="en-US" w:eastAsia="en-US" w:bidi="ar-SA"/>
+              </w:rPr>
+            </w:pPr>
+            <w:r>
+              <w:rPr>
+                <w:rFonts w:eastAsia="Calibri" w:cs=""/>
+                <w:kern w:val="0"/>
+                <w:sz w:val="22"/>
+                <w:szCs w:val="22"/>
+                <w:lang w:val="en-US" w:eastAsia="en-US" w:bidi="ar-SA"/>
+              </w:rPr>
+            </w:r>
+          </w:p>
+        </w:tc>
+        <w:tc>
+          <w:tcPr>
+            <w:tcW w:w="1323" w:type="dxa"/>
+            <w:tcBorders>
+              <w:top w:val="nil"/>
+            </w:tcBorders>
+          </w:tcPr>
+          <w:p>
+            <w:pPr>
+              <w:pStyle w:val="Normal"/>
+              <w:widowControl/>
+              <w:suppressAutoHyphens w:val="true"/>
+              <w:spacing w:lineRule="auto" w:line="240" w:before="0" w:after="0"/>
+              <w:jc w:val="left"/>
+              <w:rPr>
+                <w:rFonts w:ascii="Calibri" w:hAnsi="Calibri" w:eastAsia="Calibri" w:cs=""/>
+                <w:kern w:val="0"/>
+                <w:sz w:val="22"/>
+                <w:szCs w:val="22"/>
+                <w:lang w:val="en-US" w:eastAsia="en-US" w:bidi="ar-SA"/>
+              </w:rPr>
+            </w:pPr>
+            <w:r>
+              <w:rPr>
+                <w:rFonts w:eastAsia="Calibri" w:cs=""/>
+                <w:kern w:val="0"/>
+                <w:sz w:val="22"/>
+                <w:szCs w:val="22"/>
+                <w:lang w:val="en-US" w:eastAsia="en-US" w:bidi="ar-SA"/>
+              </w:rPr>
+            </w:r>
+          </w:p>
+        </w:tc>
+        <w:tc>
+          <w:tcPr>
+            <w:tcW w:w="1516" w:type="dxa"/>
+            <w:tcBorders>
+              <w:top w:val="nil"/>
+            </w:tcBorders>
+          </w:tcPr>
+          <w:p>
+            <w:pPr>
+              <w:pStyle w:val="Normal"/>
+              <w:widowControl/>
+              <w:suppressAutoHyphens w:val="true"/>
+              <w:spacing w:lineRule="auto" w:line="240" w:before="0" w:after="0"/>
+              <w:jc w:val="left"/>
+              <w:rPr>
+                <w:rFonts w:ascii="Calibri" w:hAnsi="Calibri" w:eastAsia="Calibri" w:cs=""/>
+                <w:kern w:val="0"/>
+                <w:sz w:val="22"/>
+                <w:szCs w:val="22"/>
+                <w:lang w:val="en-US" w:eastAsia="en-US" w:bidi="ar-SA"/>
+              </w:rPr>
+            </w:pPr>
+            <w:r>
+              <w:rPr>
+                <w:rFonts w:eastAsia="Calibri" w:cs=""/>
+                <w:kern w:val="0"/>
+                <w:sz w:val="22"/>
+                <w:szCs w:val="22"/>
+                <w:lang w:val="en-US" w:eastAsia="en-US" w:bidi="ar-SA"/>
+              </w:rPr>
+            </w:r>
+          </w:p>
+        </w:tc>
+        <w:tc>
+          <w:tcPr>
+            <w:tcW w:w="1632" w:type="dxa"/>
+            <w:tcBorders>
+              <w:top w:val="nil"/>
+            </w:tcBorders>
+          </w:tcPr>
+          <w:p>
+            <w:pPr>
+              <w:pStyle w:val="Normal"/>
+              <w:widowControl/>
+              <w:suppressAutoHyphens w:val="true"/>
+              <w:spacing w:lineRule="auto" w:line="240" w:before="0" w:after="0"/>
+              <w:jc w:val="left"/>
+              <w:rPr>
+                <w:rFonts w:ascii="Calibri" w:hAnsi="Calibri" w:eastAsia="Calibri" w:cs=""/>
+                <w:kern w:val="0"/>
+                <w:sz w:val="22"/>
+                <w:szCs w:val="22"/>
+                <w:lang w:val="en-US" w:eastAsia="en-US" w:bidi="ar-SA"/>
+              </w:rPr>
+            </w:pPr>
+            <w:r>
+              <w:rPr>
+                <w:rFonts w:eastAsia="Calibri" w:cs=""/>
+                <w:kern w:val="0"/>
+                <w:sz w:val="22"/>
+                <w:szCs w:val="22"/>
+                <w:lang w:val="en-US" w:eastAsia="en-US" w:bidi="ar-SA"/>
+              </w:rPr>
+            </w:r>
+          </w:p>
+        </w:tc>
+        <w:tc>
+          <w:tcPr>
+            <w:tcW w:w="1514" w:type="dxa"/>
+            <w:tcBorders>
+              <w:top w:val="nil"/>
+            </w:tcBorders>
+          </w:tcPr>
+          <w:p>
+            <w:pPr>
+              <w:pStyle w:val="Normal"/>
+              <w:widowControl/>
+              <w:suppressAutoHyphens w:val="true"/>
+              <w:spacing w:lineRule="auto" w:line="240" w:before="0" w:after="0"/>
+              <w:jc w:val="left"/>
+              <w:rPr>
+                <w:rFonts w:ascii="Calibri" w:hAnsi="Calibri" w:eastAsia="Calibri" w:cs=""/>
+                <w:kern w:val="0"/>
+                <w:sz w:val="22"/>
+                <w:szCs w:val="22"/>
+                <w:lang w:val="en-US" w:eastAsia="en-US" w:bidi="ar-SA"/>
+              </w:rPr>
+            </w:pPr>
+            <w:r>
+              <w:rPr>
+                <w:sz w:val="22"/>
+              </w:rPr>
+              <w:t xml:space="preserve">Week total: </w:t>
+            </w:r>
+            <w:r>
+              <w:rPr>
+                <w:sz w:val="22"/>
+              </w:rPr>
+              <w:t>405</w:t>
+            </w:r>
+            <w:r>
+              <w:rPr>
+                <w:sz w:val="22"/>
+              </w:rPr>
+              <w:t xml:space="preserve"> min</w:t>
             </w:r>
           </w:p>
         </w:tc>
@@ -3322,6 +3913,29 @@
       <w:rFonts w:cs="Arial"/>
     </w:rPr>
   </w:style>
+  <w:style w:type="paragraph" w:styleId="Style16">
+    <w:name w:val="Вміст таблиці"/>
+    <w:basedOn w:val="Normal"/>
+    <w:qFormat/>
+    <w:pPr>
+      <w:widowControl w:val="false"/>
+      <w:suppressLineNumbers/>
+    </w:pPr>
+    <w:rPr/>
+  </w:style>
+  <w:style w:type="paragraph" w:styleId="Style17">
+    <w:name w:val="Заголовок таблиці"/>
+    <w:basedOn w:val="Style16"/>
+    <w:qFormat/>
+    <w:pPr>
+      <w:suppressLineNumbers/>
+      <w:jc w:val="center"/>
+    </w:pPr>
+    <w:rPr>
+      <w:b/>
+      <w:bCs/>
+    </w:rPr>
+  </w:style>
   <w:style w:type="paragraph" w:styleId="user2">
     <w:name w:val="Вміст таблиці (user)"/>
     <w:basedOn w:val="Normal"/>
@@ -3345,31 +3959,8 @@
       <w:bCs/>
     </w:rPr>
   </w:style>
-  <w:style w:type="paragraph" w:styleId="Style16">
-    <w:name w:val="Вміст таблиці"/>
-    <w:basedOn w:val="Normal"/>
-    <w:qFormat/>
-    <w:pPr>
-      <w:widowControl w:val="false"/>
-      <w:suppressLineNumbers/>
-    </w:pPr>
-    <w:rPr/>
-  </w:style>
-  <w:style w:type="paragraph" w:styleId="Style17">
-    <w:name w:val="Заголовок таблиці"/>
-    <w:basedOn w:val="Style16"/>
-    <w:qFormat/>
-    <w:pPr>
-      <w:suppressLineNumbers/>
-      <w:jc w:val="center"/>
-    </w:pPr>
-    <w:rPr>
-      <w:b/>
-      <w:bCs/>
-    </w:rPr>
-  </w:style>
-  <w:style w:type="numbering" w:styleId="user4" w:default="1">
-    <w:name w:val="Без маркерів (user)"/>
+  <w:style w:type="numbering" w:styleId="Style18" w:default="1">
+    <w:name w:val="Без маркерів"/>
     <w:uiPriority w:val="99"/>
     <w:semiHidden/>
     <w:unhideWhenUsed/>

</xml_diff>

<commit_message>
Time Log Ovcharenko 11.10.26
</commit_message>
<xml_diff>
--- a/Reports, Logs & Evaluations/Time Logs/Ovcharenko/Time Log.docx
+++ b/Reports, Logs & Evaluations/Time Logs/Ovcharenko/Time Log.docx
@@ -2596,19 +2596,7 @@
               <w:rPr>
                 <w:sz w:val="22"/>
               </w:rPr>
-              <w:t>10/0</w:t>
-            </w:r>
-            <w:r>
-              <w:rPr>
-                <w:sz w:val="22"/>
-              </w:rPr>
-              <w:t>2</w:t>
-            </w:r>
-            <w:r>
-              <w:rPr>
-                <w:sz w:val="22"/>
-              </w:rPr>
-              <w:t>/26</w:t>
+              <w:t>10/02/26</w:t>
             </w:r>
           </w:p>
         </w:tc>
@@ -2672,19 +2660,7 @@
               <w:rPr>
                 <w:sz w:val="22"/>
               </w:rPr>
-              <w:t>4:</w:t>
-            </w:r>
-            <w:r>
-              <w:rPr>
-                <w:sz w:val="22"/>
-              </w:rPr>
-              <w:t>00</w:t>
-            </w:r>
-            <w:r>
-              <w:rPr>
-                <w:sz w:val="22"/>
-              </w:rPr>
-              <w:t xml:space="preserve"> pm</w:t>
+              <w:t>4:00 pm</w:t>
             </w:r>
           </w:p>
         </w:tc>
@@ -2820,19 +2796,7 @@
               <w:rPr>
                 <w:sz w:val="22"/>
               </w:rPr>
-              <w:t>10/0</w:t>
-            </w:r>
-            <w:r>
-              <w:rPr>
-                <w:sz w:val="22"/>
-              </w:rPr>
-              <w:t>2</w:t>
-            </w:r>
-            <w:r>
-              <w:rPr>
-                <w:sz w:val="22"/>
-              </w:rPr>
-              <w:t>/26</w:t>
+              <w:t>10/02/26</w:t>
             </w:r>
           </w:p>
         </w:tc>
@@ -2862,19 +2826,7 @@
               <w:rPr>
                 <w:sz w:val="22"/>
               </w:rPr>
-              <w:t>4:</w:t>
-            </w:r>
-            <w:r>
-              <w:rPr>
-                <w:sz w:val="22"/>
-              </w:rPr>
-              <w:t>30</w:t>
-            </w:r>
-            <w:r>
-              <w:rPr>
-                <w:sz w:val="22"/>
-              </w:rPr>
-              <w:t xml:space="preserve"> pm</w:t>
+              <w:t>4:30 pm</w:t>
             </w:r>
           </w:p>
         </w:tc>
@@ -3044,19 +2996,7 @@
               <w:rPr>
                 <w:sz w:val="22"/>
               </w:rPr>
-              <w:t>10/0</w:t>
-            </w:r>
-            <w:r>
-              <w:rPr>
-                <w:sz w:val="22"/>
-              </w:rPr>
-              <w:t>3</w:t>
-            </w:r>
-            <w:r>
-              <w:rPr>
-                <w:sz w:val="22"/>
-              </w:rPr>
-              <w:t>/26</w:t>
+              <w:t>10/03/26</w:t>
             </w:r>
           </w:p>
         </w:tc>
@@ -3116,19 +3056,7 @@
               <w:rPr>
                 <w:sz w:val="22"/>
               </w:rPr>
-              <w:t>2:</w:t>
-            </w:r>
-            <w:r>
-              <w:rPr>
-                <w:sz w:val="22"/>
-              </w:rPr>
-              <w:t>15</w:t>
-            </w:r>
-            <w:r>
-              <w:rPr>
-                <w:sz w:val="22"/>
-              </w:rPr>
-              <w:t xml:space="preserve"> pm</w:t>
+              <w:t>2:15 pm</w:t>
             </w:r>
           </w:p>
         </w:tc>
@@ -3362,13 +3290,496 @@
               <w:rPr>
                 <w:sz w:val="22"/>
               </w:rPr>
+              <w:t>Week total: 405 min</w:t>
+            </w:r>
+          </w:p>
+        </w:tc>
+      </w:tr>
+      <w:tr>
+        <w:trPr>
+          <w:trHeight w:val="231" w:hRule="atLeast"/>
+        </w:trPr>
+        <w:tc>
+          <w:tcPr>
+            <w:tcW w:w="1819" w:type="dxa"/>
+            <w:tcBorders>
+              <w:top w:val="nil"/>
+            </w:tcBorders>
+          </w:tcPr>
+          <w:p>
+            <w:pPr>
+              <w:pStyle w:val="Normal"/>
+              <w:widowControl/>
+              <w:suppressAutoHyphens w:val="true"/>
+              <w:spacing w:lineRule="auto" w:line="240" w:before="0" w:after="0"/>
+              <w:jc w:val="left"/>
+              <w:rPr>
+                <w:rFonts w:ascii="Calibri" w:hAnsi="Calibri" w:eastAsia="Calibri" w:cs=""/>
+                <w:kern w:val="0"/>
+                <w:sz w:val="22"/>
+                <w:szCs w:val="22"/>
+                <w:lang w:val="en-US" w:eastAsia="en-US" w:bidi="ar-SA"/>
+              </w:rPr>
+            </w:pPr>
+            <w:r>
+              <w:rPr>
+                <w:rFonts w:eastAsia="Calibri" w:cs=""/>
+                <w:kern w:val="0"/>
+                <w:sz w:val="22"/>
+                <w:szCs w:val="22"/>
+                <w:lang w:val="en-US" w:eastAsia="en-US" w:bidi="ar-SA"/>
+              </w:rPr>
+              <w:t xml:space="preserve">Week </w:t>
+            </w:r>
+            <w:r>
+              <w:rPr>
+                <w:rFonts w:eastAsia="Calibri" w:cs=""/>
+                <w:kern w:val="0"/>
+                <w:sz w:val="22"/>
+                <w:szCs w:val="22"/>
+                <w:lang w:val="en-US" w:eastAsia="en-US" w:bidi="ar-SA"/>
+              </w:rPr>
+              <w:t>4</w:t>
+            </w:r>
+            <w:r>
+              <w:rPr>
+                <w:rFonts w:eastAsia="Calibri" w:cs=""/>
+                <w:kern w:val="0"/>
+                <w:sz w:val="22"/>
+                <w:szCs w:val="22"/>
+                <w:lang w:val="en-US" w:eastAsia="en-US" w:bidi="ar-SA"/>
+              </w:rPr>
+              <w:t>:</w:t>
+            </w:r>
+          </w:p>
+          <w:p>
+            <w:pPr>
+              <w:pStyle w:val="Normal"/>
+              <w:widowControl/>
+              <w:suppressAutoHyphens w:val="true"/>
+              <w:spacing w:lineRule="auto" w:line="240" w:before="0" w:after="0"/>
+              <w:jc w:val="left"/>
+              <w:rPr>
+                <w:rFonts w:ascii="Calibri" w:hAnsi="Calibri" w:eastAsia="Calibri" w:cs=""/>
+                <w:kern w:val="0"/>
+                <w:sz w:val="22"/>
+                <w:szCs w:val="22"/>
+                <w:lang w:val="en-US" w:eastAsia="en-US" w:bidi="ar-SA"/>
+              </w:rPr>
+            </w:pPr>
+            <w:r>
+              <w:rPr>
+                <w:sz w:val="22"/>
+              </w:rPr>
+              <w:t>10/0</w:t>
+            </w:r>
+            <w:r>
+              <w:rPr>
+                <w:sz w:val="22"/>
+              </w:rPr>
+              <w:t>5</w:t>
+            </w:r>
+            <w:r>
+              <w:rPr>
+                <w:sz w:val="22"/>
+              </w:rPr>
+              <w:t>/26- 10/</w:t>
+            </w:r>
+            <w:r>
+              <w:rPr>
+                <w:sz w:val="22"/>
+              </w:rPr>
+              <w:t>11</w:t>
+            </w:r>
+            <w:r>
+              <w:rPr>
+                <w:sz w:val="22"/>
+              </w:rPr>
+              <w:t>/26</w:t>
+            </w:r>
+          </w:p>
+        </w:tc>
+        <w:tc>
+          <w:tcPr>
+            <w:tcW w:w="1772" w:type="dxa"/>
+            <w:tcBorders>
+              <w:top w:val="nil"/>
+            </w:tcBorders>
+          </w:tcPr>
+          <w:p>
+            <w:pPr>
+              <w:pStyle w:val="Normal"/>
+              <w:widowControl/>
+              <w:suppressAutoHyphens w:val="true"/>
+              <w:spacing w:lineRule="auto" w:line="240" w:before="0" w:after="0"/>
+              <w:jc w:val="left"/>
+              <w:rPr>
+                <w:rFonts w:ascii="Calibri" w:hAnsi="Calibri" w:eastAsia="Calibri" w:cs=""/>
+                <w:kern w:val="0"/>
+                <w:sz w:val="22"/>
+                <w:szCs w:val="22"/>
+                <w:lang w:val="en-US" w:eastAsia="en-US" w:bidi="ar-SA"/>
+              </w:rPr>
+            </w:pPr>
+            <w:r>
+              <w:rPr>
+                <w:rFonts w:eastAsia="Calibri" w:cs=""/>
+                <w:kern w:val="0"/>
+                <w:sz w:val="22"/>
+                <w:szCs w:val="22"/>
+                <w:lang w:val="en-US" w:eastAsia="en-US" w:bidi="ar-SA"/>
+              </w:rPr>
+              <w:t>Edits and Critiques to Phase II Diagrams</w:t>
+            </w:r>
+          </w:p>
+        </w:tc>
+        <w:tc>
+          <w:tcPr>
+            <w:tcW w:w="1323" w:type="dxa"/>
+            <w:tcBorders>
+              <w:top w:val="nil"/>
+            </w:tcBorders>
+          </w:tcPr>
+          <w:p>
+            <w:pPr>
+              <w:pStyle w:val="Normal"/>
+              <w:widowControl/>
+              <w:suppressAutoHyphens w:val="true"/>
+              <w:spacing w:lineRule="auto" w:line="240" w:before="0" w:after="0"/>
+              <w:jc w:val="left"/>
+              <w:rPr>
+                <w:rFonts w:ascii="Calibri" w:hAnsi="Calibri" w:eastAsia="Calibri" w:cs=""/>
+                <w:kern w:val="0"/>
+                <w:sz w:val="22"/>
+                <w:szCs w:val="22"/>
+                <w:lang w:val="en-US" w:eastAsia="en-US" w:bidi="ar-SA"/>
+              </w:rPr>
+            </w:pPr>
+            <w:r>
+              <w:rPr>
+                <w:sz w:val="22"/>
+              </w:rPr>
+              <w:t>10/</w:t>
+            </w:r>
+            <w:r>
+              <w:rPr>
+                <w:sz w:val="22"/>
+              </w:rPr>
+              <w:t>11</w:t>
+            </w:r>
+            <w:r>
+              <w:rPr>
+                <w:sz w:val="22"/>
+              </w:rPr>
+              <w:t>/26</w:t>
+            </w:r>
+          </w:p>
+        </w:tc>
+        <w:tc>
+          <w:tcPr>
+            <w:tcW w:w="1516" w:type="dxa"/>
+            <w:tcBorders>
+              <w:top w:val="nil"/>
+            </w:tcBorders>
+          </w:tcPr>
+          <w:p>
+            <w:pPr>
+              <w:pStyle w:val="Normal"/>
+              <w:widowControl/>
+              <w:suppressAutoHyphens w:val="true"/>
+              <w:spacing w:lineRule="auto" w:line="240" w:before="0" w:after="0"/>
+              <w:jc w:val="left"/>
+              <w:rPr>
+                <w:rFonts w:ascii="Calibri" w:hAnsi="Calibri" w:eastAsia="Calibri" w:cs=""/>
+                <w:kern w:val="0"/>
+                <w:sz w:val="22"/>
+                <w:szCs w:val="22"/>
+                <w:lang w:val="en-US" w:eastAsia="en-US" w:bidi="ar-SA"/>
+              </w:rPr>
+            </w:pPr>
+            <w:r>
+              <w:rPr>
+                <w:rFonts w:eastAsia="Calibri" w:cs=""/>
+                <w:kern w:val="0"/>
+                <w:sz w:val="22"/>
+                <w:szCs w:val="22"/>
+                <w:lang w:val="en-US" w:eastAsia="en-US" w:bidi="ar-SA"/>
+              </w:rPr>
+              <w:t>2:00 pm</w:t>
+            </w:r>
+          </w:p>
+        </w:tc>
+        <w:tc>
+          <w:tcPr>
+            <w:tcW w:w="1632" w:type="dxa"/>
+            <w:tcBorders>
+              <w:top w:val="nil"/>
+            </w:tcBorders>
+          </w:tcPr>
+          <w:p>
+            <w:pPr>
+              <w:pStyle w:val="Normal"/>
+              <w:widowControl/>
+              <w:suppressAutoHyphens w:val="true"/>
+              <w:spacing w:lineRule="auto" w:line="240" w:before="0" w:after="0"/>
+              <w:jc w:val="left"/>
+              <w:rPr>
+                <w:rFonts w:ascii="Calibri" w:hAnsi="Calibri" w:eastAsia="Calibri" w:cs=""/>
+                <w:kern w:val="0"/>
+                <w:sz w:val="22"/>
+                <w:szCs w:val="22"/>
+                <w:lang w:val="en-US" w:eastAsia="en-US" w:bidi="ar-SA"/>
+              </w:rPr>
+            </w:pPr>
+            <w:r>
+              <w:rPr>
+                <w:rFonts w:eastAsia="Calibri" w:cs=""/>
+                <w:kern w:val="0"/>
+                <w:sz w:val="22"/>
+                <w:szCs w:val="22"/>
+                <w:lang w:val="en-US" w:eastAsia="en-US" w:bidi="ar-SA"/>
+              </w:rPr>
+              <w:t>3:30 pm</w:t>
+            </w:r>
+          </w:p>
+        </w:tc>
+        <w:tc>
+          <w:tcPr>
+            <w:tcW w:w="1514" w:type="dxa"/>
+            <w:tcBorders>
+              <w:top w:val="nil"/>
+            </w:tcBorders>
+          </w:tcPr>
+          <w:p>
+            <w:pPr>
+              <w:pStyle w:val="Normal"/>
+              <w:widowControl/>
+              <w:suppressAutoHyphens w:val="true"/>
+              <w:spacing w:lineRule="auto" w:line="240" w:before="0" w:after="0"/>
+              <w:jc w:val="left"/>
+              <w:rPr>
+                <w:rFonts w:ascii="Calibri" w:hAnsi="Calibri" w:eastAsia="Calibri" w:cs=""/>
+                <w:kern w:val="0"/>
+                <w:sz w:val="22"/>
+                <w:szCs w:val="22"/>
+                <w:lang w:val="en-US" w:eastAsia="en-US" w:bidi="ar-SA"/>
+              </w:rPr>
+            </w:pPr>
+            <w:r>
+              <w:rPr>
+                <w:rFonts w:eastAsia="Calibri" w:cs=""/>
+                <w:kern w:val="0"/>
+                <w:sz w:val="22"/>
+                <w:szCs w:val="22"/>
+                <w:lang w:val="en-US" w:eastAsia="en-US" w:bidi="ar-SA"/>
+              </w:rPr>
+              <w:t>90 min</w:t>
+            </w:r>
+          </w:p>
+        </w:tc>
+      </w:tr>
+      <w:tr>
+        <w:trPr>
+          <w:trHeight w:val="231" w:hRule="atLeast"/>
+        </w:trPr>
+        <w:tc>
+          <w:tcPr>
+            <w:tcW w:w="1819" w:type="dxa"/>
+            <w:tcBorders>
+              <w:top w:val="nil"/>
+            </w:tcBorders>
+          </w:tcPr>
+          <w:p>
+            <w:pPr>
+              <w:pStyle w:val="Normal"/>
+              <w:widowControl/>
+              <w:suppressAutoHyphens w:val="true"/>
+              <w:spacing w:lineRule="auto" w:line="240" w:before="0" w:after="0"/>
+              <w:jc w:val="left"/>
+              <w:rPr>
+                <w:rFonts w:ascii="Calibri" w:hAnsi="Calibri" w:eastAsia="Calibri" w:cs=""/>
+                <w:kern w:val="0"/>
+                <w:sz w:val="22"/>
+                <w:szCs w:val="22"/>
+                <w:lang w:val="en-US" w:eastAsia="en-US" w:bidi="ar-SA"/>
+              </w:rPr>
+            </w:pPr>
+            <w:r>
+              <w:rPr>
+                <w:rFonts w:eastAsia="Calibri" w:cs=""/>
+                <w:kern w:val="0"/>
+                <w:sz w:val="22"/>
+                <w:szCs w:val="22"/>
+                <w:lang w:val="en-US" w:eastAsia="en-US" w:bidi="ar-SA"/>
+              </w:rPr>
+            </w:r>
+          </w:p>
+        </w:tc>
+        <w:tc>
+          <w:tcPr>
+            <w:tcW w:w="1772" w:type="dxa"/>
+            <w:tcBorders>
+              <w:top w:val="nil"/>
+            </w:tcBorders>
+          </w:tcPr>
+          <w:p>
+            <w:pPr>
+              <w:pStyle w:val="Normal"/>
+              <w:widowControl/>
+              <w:suppressAutoHyphens w:val="true"/>
+              <w:spacing w:lineRule="auto" w:line="240" w:before="0" w:after="0"/>
+              <w:jc w:val="left"/>
+              <w:rPr>
+                <w:rFonts w:ascii="Calibri" w:hAnsi="Calibri" w:eastAsia="Calibri" w:cs=""/>
+                <w:kern w:val="0"/>
+                <w:sz w:val="22"/>
+                <w:szCs w:val="22"/>
+                <w:lang w:val="en-US" w:eastAsia="en-US" w:bidi="ar-SA"/>
+              </w:rPr>
+            </w:pPr>
+            <w:r>
+              <w:rPr>
+                <w:rFonts w:eastAsia="Calibri" w:cs=""/>
+                <w:kern w:val="0"/>
+                <w:sz w:val="22"/>
+                <w:szCs w:val="22"/>
+                <w:lang w:val="en-US" w:eastAsia="en-US" w:bidi="ar-SA"/>
+              </w:rPr>
+            </w:r>
+          </w:p>
+        </w:tc>
+        <w:tc>
+          <w:tcPr>
+            <w:tcW w:w="1323" w:type="dxa"/>
+            <w:tcBorders>
+              <w:top w:val="nil"/>
+            </w:tcBorders>
+          </w:tcPr>
+          <w:p>
+            <w:pPr>
+              <w:pStyle w:val="Normal"/>
+              <w:widowControl/>
+              <w:suppressAutoHyphens w:val="true"/>
+              <w:spacing w:lineRule="auto" w:line="240" w:before="0" w:after="0"/>
+              <w:jc w:val="left"/>
+              <w:rPr>
+                <w:rFonts w:ascii="Calibri" w:hAnsi="Calibri" w:eastAsia="Calibri" w:cs=""/>
+                <w:kern w:val="0"/>
+                <w:sz w:val="22"/>
+                <w:szCs w:val="22"/>
+                <w:lang w:val="en-US" w:eastAsia="en-US" w:bidi="ar-SA"/>
+              </w:rPr>
+            </w:pPr>
+            <w:r>
+              <w:rPr>
+                <w:rFonts w:eastAsia="Calibri" w:cs=""/>
+                <w:kern w:val="0"/>
+                <w:sz w:val="22"/>
+                <w:szCs w:val="22"/>
+                <w:lang w:val="en-US" w:eastAsia="en-US" w:bidi="ar-SA"/>
+              </w:rPr>
+            </w:r>
+          </w:p>
+        </w:tc>
+        <w:tc>
+          <w:tcPr>
+            <w:tcW w:w="1516" w:type="dxa"/>
+            <w:tcBorders>
+              <w:top w:val="nil"/>
+            </w:tcBorders>
+          </w:tcPr>
+          <w:p>
+            <w:pPr>
+              <w:pStyle w:val="Normal"/>
+              <w:widowControl/>
+              <w:suppressAutoHyphens w:val="true"/>
+              <w:spacing w:lineRule="auto" w:line="240" w:before="0" w:after="0"/>
+              <w:jc w:val="left"/>
+              <w:rPr>
+                <w:rFonts w:ascii="Calibri" w:hAnsi="Calibri" w:eastAsia="Calibri" w:cs=""/>
+                <w:kern w:val="0"/>
+                <w:sz w:val="22"/>
+                <w:szCs w:val="22"/>
+                <w:lang w:val="en-US" w:eastAsia="en-US" w:bidi="ar-SA"/>
+              </w:rPr>
+            </w:pPr>
+            <w:r>
+              <w:rPr>
+                <w:rFonts w:eastAsia="Calibri" w:cs=""/>
+                <w:kern w:val="0"/>
+                <w:sz w:val="22"/>
+                <w:szCs w:val="22"/>
+                <w:lang w:val="en-US" w:eastAsia="en-US" w:bidi="ar-SA"/>
+              </w:rPr>
+            </w:r>
+          </w:p>
+        </w:tc>
+        <w:tc>
+          <w:tcPr>
+            <w:tcW w:w="1632" w:type="dxa"/>
+            <w:tcBorders>
+              <w:top w:val="nil"/>
+            </w:tcBorders>
+          </w:tcPr>
+          <w:p>
+            <w:pPr>
+              <w:pStyle w:val="Normal"/>
+              <w:widowControl/>
+              <w:suppressAutoHyphens w:val="true"/>
+              <w:spacing w:lineRule="auto" w:line="240" w:before="0" w:after="0"/>
+              <w:jc w:val="left"/>
+              <w:rPr>
+                <w:rFonts w:ascii="Calibri" w:hAnsi="Calibri" w:eastAsia="Calibri" w:cs=""/>
+                <w:kern w:val="0"/>
+                <w:sz w:val="22"/>
+                <w:szCs w:val="22"/>
+                <w:lang w:val="en-US" w:eastAsia="en-US" w:bidi="ar-SA"/>
+              </w:rPr>
+            </w:pPr>
+            <w:r>
+              <w:rPr>
+                <w:rFonts w:eastAsia="Calibri" w:cs=""/>
+                <w:kern w:val="0"/>
+                <w:sz w:val="22"/>
+                <w:szCs w:val="22"/>
+                <w:lang w:val="en-US" w:eastAsia="en-US" w:bidi="ar-SA"/>
+              </w:rPr>
+            </w:r>
+          </w:p>
+        </w:tc>
+        <w:tc>
+          <w:tcPr>
+            <w:tcW w:w="1514" w:type="dxa"/>
+            <w:tcBorders>
+              <w:top w:val="nil"/>
+            </w:tcBorders>
+          </w:tcPr>
+          <w:p>
+            <w:pPr>
+              <w:pStyle w:val="Normal"/>
+              <w:widowControl/>
+              <w:suppressAutoHyphens w:val="true"/>
+              <w:spacing w:lineRule="auto" w:line="240" w:before="0" w:after="0"/>
+              <w:jc w:val="left"/>
+              <w:rPr>
+                <w:rFonts w:ascii="Calibri" w:hAnsi="Calibri" w:eastAsia="Calibri" w:cs=""/>
+                <w:kern w:val="0"/>
+                <w:sz w:val="22"/>
+                <w:szCs w:val="22"/>
+                <w:lang w:val="en-US" w:eastAsia="en-US" w:bidi="ar-SA"/>
+              </w:rPr>
+            </w:pPr>
+            <w:r>
+              <w:rPr>
+                <w:sz w:val="22"/>
+              </w:rPr>
               <w:t xml:space="preserve">Week total: </w:t>
             </w:r>
             <w:r>
               <w:rPr>
                 <w:sz w:val="22"/>
               </w:rPr>
-              <w:t>405</w:t>
+              <w:t>90</w:t>
             </w:r>
             <w:r>
               <w:rPr>
@@ -3913,6 +4324,29 @@
       <w:rFonts w:cs="Arial"/>
     </w:rPr>
   </w:style>
+  <w:style w:type="paragraph" w:styleId="user2">
+    <w:name w:val="Вміст таблиці (user)"/>
+    <w:basedOn w:val="Normal"/>
+    <w:qFormat/>
+    <w:pPr>
+      <w:widowControl w:val="false"/>
+      <w:suppressLineNumbers/>
+    </w:pPr>
+    <w:rPr/>
+  </w:style>
+  <w:style w:type="paragraph" w:styleId="user3">
+    <w:name w:val="Заголовок таблиці (user)"/>
+    <w:basedOn w:val="user2"/>
+    <w:qFormat/>
+    <w:pPr>
+      <w:suppressLineNumbers/>
+      <w:jc w:val="center"/>
+    </w:pPr>
+    <w:rPr>
+      <w:b/>
+      <w:bCs/>
+    </w:rPr>
+  </w:style>
   <w:style w:type="paragraph" w:styleId="Style16">
     <w:name w:val="Вміст таблиці"/>
     <w:basedOn w:val="Normal"/>
@@ -3936,31 +4370,8 @@
       <w:bCs/>
     </w:rPr>
   </w:style>
-  <w:style w:type="paragraph" w:styleId="user2">
-    <w:name w:val="Вміст таблиці (user)"/>
-    <w:basedOn w:val="Normal"/>
-    <w:qFormat/>
-    <w:pPr>
-      <w:widowControl w:val="false"/>
-      <w:suppressLineNumbers/>
-    </w:pPr>
-    <w:rPr/>
-  </w:style>
-  <w:style w:type="paragraph" w:styleId="user3">
-    <w:name w:val="Заголовок таблиці (user)"/>
-    <w:basedOn w:val="user2"/>
-    <w:qFormat/>
-    <w:pPr>
-      <w:suppressLineNumbers/>
-      <w:jc w:val="center"/>
-    </w:pPr>
-    <w:rPr>
-      <w:b/>
-      <w:bCs/>
-    </w:rPr>
-  </w:style>
-  <w:style w:type="numbering" w:styleId="Style18" w:default="1">
-    <w:name w:val="Без маркерів"/>
+  <w:style w:type="numbering" w:styleId="user4" w:default="1">
+    <w:name w:val="Без маркерів (user)"/>
     <w:uiPriority w:val="99"/>
     <w:semiHidden/>
     <w:unhideWhenUsed/>

</xml_diff>

<commit_message>
Time Log Ovcharenko 18.10.26
</commit_message>
<xml_diff>
--- a/Reports, Logs & Evaluations/Time Logs/Ovcharenko/Time Log.docx
+++ b/Reports, Logs & Evaluations/Time Logs/Ovcharenko/Time Log.docx
@@ -3329,73 +3329,29 @@
                 <w:szCs w:val="22"/>
                 <w:lang w:val="en-US" w:eastAsia="en-US" w:bidi="ar-SA"/>
               </w:rPr>
-              <w:t xml:space="preserve">Week </w:t>
-            </w:r>
-            <w:r>
-              <w:rPr>
-                <w:rFonts w:eastAsia="Calibri" w:cs=""/>
-                <w:kern w:val="0"/>
-                <w:sz w:val="22"/>
-                <w:szCs w:val="22"/>
-                <w:lang w:val="en-US" w:eastAsia="en-US" w:bidi="ar-SA"/>
-              </w:rPr>
-              <w:t>4</w:t>
-            </w:r>
-            <w:r>
-              <w:rPr>
-                <w:rFonts w:eastAsia="Calibri" w:cs=""/>
-                <w:kern w:val="0"/>
-                <w:sz w:val="22"/>
-                <w:szCs w:val="22"/>
-                <w:lang w:val="en-US" w:eastAsia="en-US" w:bidi="ar-SA"/>
-              </w:rPr>
-              <w:t>:</w:t>
-            </w:r>
-          </w:p>
-          <w:p>
-            <w:pPr>
-              <w:pStyle w:val="Normal"/>
-              <w:widowControl/>
-              <w:suppressAutoHyphens w:val="true"/>
-              <w:spacing w:lineRule="auto" w:line="240" w:before="0" w:after="0"/>
-              <w:jc w:val="left"/>
-              <w:rPr>
-                <w:rFonts w:ascii="Calibri" w:hAnsi="Calibri" w:eastAsia="Calibri" w:cs=""/>
-                <w:kern w:val="0"/>
-                <w:sz w:val="22"/>
-                <w:szCs w:val="22"/>
-                <w:lang w:val="en-US" w:eastAsia="en-US" w:bidi="ar-SA"/>
-              </w:rPr>
-            </w:pPr>
-            <w:r>
-              <w:rPr>
-                <w:sz w:val="22"/>
-              </w:rPr>
-              <w:t>10/0</w:t>
-            </w:r>
-            <w:r>
-              <w:rPr>
-                <w:sz w:val="22"/>
-              </w:rPr>
-              <w:t>5</w:t>
-            </w:r>
-            <w:r>
-              <w:rPr>
-                <w:sz w:val="22"/>
-              </w:rPr>
-              <w:t>/26- 10/</w:t>
-            </w:r>
-            <w:r>
-              <w:rPr>
-                <w:sz w:val="22"/>
-              </w:rPr>
-              <w:t>11</w:t>
-            </w:r>
-            <w:r>
-              <w:rPr>
-                <w:sz w:val="22"/>
-              </w:rPr>
-              <w:t>/26</w:t>
+              <w:t>Week 4:</w:t>
+            </w:r>
+          </w:p>
+          <w:p>
+            <w:pPr>
+              <w:pStyle w:val="Normal"/>
+              <w:widowControl/>
+              <w:suppressAutoHyphens w:val="true"/>
+              <w:spacing w:lineRule="auto" w:line="240" w:before="0" w:after="0"/>
+              <w:jc w:val="left"/>
+              <w:rPr>
+                <w:rFonts w:ascii="Calibri" w:hAnsi="Calibri" w:eastAsia="Calibri" w:cs=""/>
+                <w:kern w:val="0"/>
+                <w:sz w:val="22"/>
+                <w:szCs w:val="22"/>
+                <w:lang w:val="en-US" w:eastAsia="en-US" w:bidi="ar-SA"/>
+              </w:rPr>
+            </w:pPr>
+            <w:r>
+              <w:rPr>
+                <w:sz w:val="22"/>
+              </w:rPr>
+              <w:t>10/05/26- 10/11/26</w:t>
             </w:r>
           </w:p>
         </w:tc>
@@ -3459,19 +3415,7 @@
               <w:rPr>
                 <w:sz w:val="22"/>
               </w:rPr>
-              <w:t>10/</w:t>
-            </w:r>
-            <w:r>
-              <w:rPr>
-                <w:sz w:val="22"/>
-              </w:rPr>
-              <w:t>11</w:t>
-            </w:r>
-            <w:r>
-              <w:rPr>
-                <w:sz w:val="22"/>
-              </w:rPr>
-              <w:t>/26</w:t>
+              <w:t>10/11/26</w:t>
             </w:r>
           </w:p>
         </w:tc>
@@ -3773,19 +3717,860 @@
               <w:rPr>
                 <w:sz w:val="22"/>
               </w:rPr>
+              <w:t>Week total: 90 min</w:t>
+            </w:r>
+          </w:p>
+        </w:tc>
+      </w:tr>
+      <w:tr>
+        <w:trPr>
+          <w:trHeight w:val="231" w:hRule="atLeast"/>
+        </w:trPr>
+        <w:tc>
+          <w:tcPr>
+            <w:tcW w:w="1819" w:type="dxa"/>
+            <w:tcBorders>
+              <w:top w:val="nil"/>
+            </w:tcBorders>
+          </w:tcPr>
+          <w:p>
+            <w:pPr>
+              <w:pStyle w:val="Normal"/>
+              <w:widowControl/>
+              <w:suppressAutoHyphens w:val="true"/>
+              <w:spacing w:lineRule="auto" w:line="240" w:before="0" w:after="0"/>
+              <w:jc w:val="left"/>
+              <w:rPr>
+                <w:rFonts w:ascii="Calibri" w:hAnsi="Calibri" w:eastAsia="Calibri" w:cs=""/>
+                <w:kern w:val="0"/>
+                <w:sz w:val="22"/>
+                <w:szCs w:val="22"/>
+                <w:lang w:val="en-US" w:eastAsia="en-US" w:bidi="ar-SA"/>
+              </w:rPr>
+            </w:pPr>
+            <w:r>
+              <w:rPr>
+                <w:rFonts w:eastAsia="Calibri" w:cs=""/>
+                <w:kern w:val="0"/>
+                <w:sz w:val="22"/>
+                <w:szCs w:val="22"/>
+                <w:lang w:val="en-US" w:eastAsia="en-US" w:bidi="ar-SA"/>
+              </w:rPr>
+              <w:t>Week 5:</w:t>
+            </w:r>
+          </w:p>
+          <w:p>
+            <w:pPr>
+              <w:pStyle w:val="Normal"/>
+              <w:widowControl/>
+              <w:suppressAutoHyphens w:val="true"/>
+              <w:spacing w:lineRule="auto" w:line="240" w:before="0" w:after="0"/>
+              <w:jc w:val="left"/>
+              <w:rPr>
+                <w:rFonts w:ascii="Calibri" w:hAnsi="Calibri" w:eastAsia="Calibri" w:cs=""/>
+                <w:kern w:val="0"/>
+                <w:sz w:val="22"/>
+                <w:szCs w:val="22"/>
+                <w:lang w:val="en-US" w:eastAsia="en-US" w:bidi="ar-SA"/>
+              </w:rPr>
+            </w:pPr>
+            <w:r>
+              <w:rPr>
+                <w:sz w:val="22"/>
+              </w:rPr>
+              <w:t>10/12/26- 10/18/26</w:t>
+            </w:r>
+          </w:p>
+        </w:tc>
+        <w:tc>
+          <w:tcPr>
+            <w:tcW w:w="1772" w:type="dxa"/>
+            <w:tcBorders>
+              <w:top w:val="nil"/>
+            </w:tcBorders>
+          </w:tcPr>
+          <w:p>
+            <w:pPr>
+              <w:pStyle w:val="Normal"/>
+              <w:widowControl/>
+              <w:suppressAutoHyphens w:val="true"/>
+              <w:spacing w:lineRule="auto" w:line="240" w:before="0" w:after="0"/>
+              <w:jc w:val="left"/>
+              <w:rPr>
+                <w:rFonts w:ascii="Calibri" w:hAnsi="Calibri" w:eastAsia="Calibri" w:cs=""/>
+                <w:kern w:val="0"/>
+                <w:sz w:val="22"/>
+                <w:szCs w:val="22"/>
+                <w:lang w:val="en-US" w:eastAsia="en-US" w:bidi="ar-SA"/>
+              </w:rPr>
+            </w:pPr>
+            <w:r>
+              <w:rPr>
+                <w:rFonts w:eastAsia="Calibri" w:cs=""/>
+                <w:kern w:val="0"/>
+                <w:sz w:val="22"/>
+                <w:szCs w:val="22"/>
+                <w:lang w:val="en-US" w:eastAsia="en-US" w:bidi="ar-SA"/>
+              </w:rPr>
+              <w:t>In-person Meeting with Client/Instructor</w:t>
+            </w:r>
+          </w:p>
+        </w:tc>
+        <w:tc>
+          <w:tcPr>
+            <w:tcW w:w="1323" w:type="dxa"/>
+            <w:tcBorders>
+              <w:top w:val="nil"/>
+            </w:tcBorders>
+          </w:tcPr>
+          <w:p>
+            <w:pPr>
+              <w:pStyle w:val="Normal"/>
+              <w:widowControl/>
+              <w:suppressAutoHyphens w:val="true"/>
+              <w:spacing w:lineRule="auto" w:line="240" w:before="0" w:after="0"/>
+              <w:jc w:val="left"/>
+              <w:rPr>
+                <w:rFonts w:ascii="Calibri" w:hAnsi="Calibri" w:eastAsia="Calibri" w:cs=""/>
+                <w:kern w:val="0"/>
+                <w:sz w:val="22"/>
+                <w:szCs w:val="22"/>
+                <w:lang w:val="en-US" w:eastAsia="en-US" w:bidi="ar-SA"/>
+              </w:rPr>
+            </w:pPr>
+            <w:r>
+              <w:rPr>
+                <w:sz w:val="22"/>
+              </w:rPr>
+              <w:t>10/15/26</w:t>
+            </w:r>
+          </w:p>
+        </w:tc>
+        <w:tc>
+          <w:tcPr>
+            <w:tcW w:w="1516" w:type="dxa"/>
+            <w:tcBorders>
+              <w:top w:val="nil"/>
+            </w:tcBorders>
+          </w:tcPr>
+          <w:p>
+            <w:pPr>
+              <w:pStyle w:val="Normal"/>
+              <w:widowControl/>
+              <w:suppressAutoHyphens w:val="true"/>
+              <w:spacing w:lineRule="auto" w:line="240" w:before="0" w:after="0"/>
+              <w:jc w:val="left"/>
+              <w:rPr>
+                <w:rFonts w:ascii="Calibri" w:hAnsi="Calibri" w:eastAsia="Calibri" w:cs=""/>
+                <w:kern w:val="0"/>
+                <w:sz w:val="22"/>
+                <w:szCs w:val="22"/>
+                <w:lang w:val="en-US" w:eastAsia="en-US" w:bidi="ar-SA"/>
+              </w:rPr>
+            </w:pPr>
+            <w:r>
+              <w:rPr>
+                <w:rFonts w:eastAsia="Calibri" w:cs=""/>
+                <w:kern w:val="0"/>
+                <w:sz w:val="22"/>
+                <w:szCs w:val="22"/>
+                <w:lang w:val="en-US" w:eastAsia="en-US" w:bidi="ar-SA"/>
+              </w:rPr>
+              <w:t>3:00 pm</w:t>
+            </w:r>
+          </w:p>
+        </w:tc>
+        <w:tc>
+          <w:tcPr>
+            <w:tcW w:w="1632" w:type="dxa"/>
+            <w:tcBorders>
+              <w:top w:val="nil"/>
+            </w:tcBorders>
+          </w:tcPr>
+          <w:p>
+            <w:pPr>
+              <w:pStyle w:val="Normal"/>
+              <w:widowControl/>
+              <w:suppressAutoHyphens w:val="true"/>
+              <w:spacing w:lineRule="auto" w:line="240" w:before="0" w:after="0"/>
+              <w:jc w:val="left"/>
+              <w:rPr>
+                <w:rFonts w:ascii="Calibri" w:hAnsi="Calibri" w:eastAsia="Calibri" w:cs=""/>
+                <w:kern w:val="0"/>
+                <w:sz w:val="22"/>
+                <w:szCs w:val="22"/>
+                <w:lang w:val="en-US" w:eastAsia="en-US" w:bidi="ar-SA"/>
+              </w:rPr>
+            </w:pPr>
+            <w:r>
+              <w:rPr>
+                <w:rFonts w:eastAsia="Calibri" w:cs=""/>
+                <w:kern w:val="0"/>
+                <w:sz w:val="22"/>
+                <w:szCs w:val="22"/>
+                <w:lang w:val="en-US" w:eastAsia="en-US" w:bidi="ar-SA"/>
+              </w:rPr>
+              <w:t>5:00 pm</w:t>
+            </w:r>
+          </w:p>
+        </w:tc>
+        <w:tc>
+          <w:tcPr>
+            <w:tcW w:w="1514" w:type="dxa"/>
+            <w:tcBorders>
+              <w:top w:val="nil"/>
+            </w:tcBorders>
+          </w:tcPr>
+          <w:p>
+            <w:pPr>
+              <w:pStyle w:val="Normal"/>
+              <w:widowControl/>
+              <w:suppressAutoHyphens w:val="true"/>
+              <w:spacing w:lineRule="auto" w:line="240" w:before="0" w:after="0"/>
+              <w:jc w:val="left"/>
+              <w:rPr>
+                <w:rFonts w:ascii="Calibri" w:hAnsi="Calibri" w:eastAsia="Calibri" w:cs=""/>
+                <w:kern w:val="0"/>
+                <w:sz w:val="22"/>
+                <w:szCs w:val="22"/>
+                <w:lang w:val="en-US" w:eastAsia="en-US" w:bidi="ar-SA"/>
+              </w:rPr>
+            </w:pPr>
+            <w:r>
+              <w:rPr>
+                <w:rFonts w:eastAsia="Calibri" w:cs=""/>
+                <w:kern w:val="0"/>
+                <w:sz w:val="22"/>
+                <w:szCs w:val="22"/>
+                <w:lang w:val="en-US" w:eastAsia="en-US" w:bidi="ar-SA"/>
+              </w:rPr>
+              <w:t>120 min</w:t>
+            </w:r>
+          </w:p>
+        </w:tc>
+      </w:tr>
+      <w:tr>
+        <w:trPr>
+          <w:trHeight w:val="231" w:hRule="atLeast"/>
+        </w:trPr>
+        <w:tc>
+          <w:tcPr>
+            <w:tcW w:w="1819" w:type="dxa"/>
+            <w:tcBorders>
+              <w:top w:val="nil"/>
+            </w:tcBorders>
+          </w:tcPr>
+          <w:p>
+            <w:pPr>
+              <w:pStyle w:val="Normal"/>
+              <w:widowControl/>
+              <w:suppressAutoHyphens w:val="true"/>
+              <w:spacing w:lineRule="auto" w:line="240" w:before="0" w:after="0"/>
+              <w:jc w:val="left"/>
+              <w:rPr>
+                <w:rFonts w:ascii="Calibri" w:hAnsi="Calibri" w:eastAsia="Calibri" w:cs=""/>
+                <w:kern w:val="0"/>
+                <w:sz w:val="22"/>
+                <w:szCs w:val="22"/>
+                <w:lang w:val="en-US" w:eastAsia="en-US" w:bidi="ar-SA"/>
+              </w:rPr>
+            </w:pPr>
+            <w:r>
+              <w:rPr>
+                <w:rFonts w:eastAsia="Calibri" w:cs=""/>
+                <w:kern w:val="0"/>
+                <w:sz w:val="22"/>
+                <w:szCs w:val="22"/>
+                <w:lang w:val="en-US" w:eastAsia="en-US" w:bidi="ar-SA"/>
+              </w:rPr>
+            </w:r>
+          </w:p>
+        </w:tc>
+        <w:tc>
+          <w:tcPr>
+            <w:tcW w:w="1772" w:type="dxa"/>
+            <w:tcBorders>
+              <w:top w:val="nil"/>
+            </w:tcBorders>
+          </w:tcPr>
+          <w:p>
+            <w:pPr>
+              <w:pStyle w:val="Normal"/>
+              <w:widowControl/>
+              <w:suppressAutoHyphens w:val="true"/>
+              <w:spacing w:lineRule="auto" w:line="240" w:before="0" w:after="0"/>
+              <w:jc w:val="left"/>
+              <w:rPr>
+                <w:rFonts w:ascii="Calibri" w:hAnsi="Calibri" w:eastAsia="Calibri" w:cs=""/>
+                <w:kern w:val="0"/>
+                <w:sz w:val="22"/>
+                <w:szCs w:val="22"/>
+                <w:lang w:val="en-US" w:eastAsia="en-US" w:bidi="ar-SA"/>
+              </w:rPr>
+            </w:pPr>
+            <w:r>
+              <w:rPr>
+                <w:rFonts w:eastAsia="Calibri" w:cs=""/>
+                <w:kern w:val="0"/>
+                <w:sz w:val="22"/>
+                <w:szCs w:val="22"/>
+                <w:lang w:val="en-US" w:eastAsia="en-US" w:bidi="ar-SA"/>
+              </w:rPr>
+              <w:t>Creating the Testing Plan</w:t>
+            </w:r>
+          </w:p>
+        </w:tc>
+        <w:tc>
+          <w:tcPr>
+            <w:tcW w:w="1323" w:type="dxa"/>
+            <w:tcBorders>
+              <w:top w:val="nil"/>
+            </w:tcBorders>
+          </w:tcPr>
+          <w:p>
+            <w:pPr>
+              <w:pStyle w:val="Normal"/>
+              <w:widowControl/>
+              <w:suppressAutoHyphens w:val="true"/>
+              <w:spacing w:lineRule="auto" w:line="240" w:before="0" w:after="0"/>
+              <w:jc w:val="left"/>
+              <w:rPr>
+                <w:rFonts w:ascii="Calibri" w:hAnsi="Calibri" w:eastAsia="Calibri" w:cs=""/>
+                <w:kern w:val="0"/>
+                <w:sz w:val="22"/>
+                <w:szCs w:val="22"/>
+                <w:lang w:val="en-US" w:eastAsia="en-US" w:bidi="ar-SA"/>
+              </w:rPr>
+            </w:pPr>
+            <w:r>
+              <w:rPr>
+                <w:sz w:val="22"/>
+              </w:rPr>
+              <w:t>10/16/26</w:t>
+            </w:r>
+          </w:p>
+        </w:tc>
+        <w:tc>
+          <w:tcPr>
+            <w:tcW w:w="1516" w:type="dxa"/>
+            <w:tcBorders>
+              <w:top w:val="nil"/>
+            </w:tcBorders>
+          </w:tcPr>
+          <w:p>
+            <w:pPr>
+              <w:pStyle w:val="Normal"/>
+              <w:widowControl/>
+              <w:suppressAutoHyphens w:val="true"/>
+              <w:spacing w:lineRule="auto" w:line="240" w:before="0" w:after="0"/>
+              <w:jc w:val="left"/>
+              <w:rPr>
+                <w:rFonts w:ascii="Calibri" w:hAnsi="Calibri" w:eastAsia="Calibri" w:cs=""/>
+                <w:kern w:val="0"/>
+                <w:sz w:val="22"/>
+                <w:szCs w:val="22"/>
+                <w:lang w:val="en-US" w:eastAsia="en-US" w:bidi="ar-SA"/>
+              </w:rPr>
+            </w:pPr>
+            <w:r>
+              <w:rPr>
+                <w:rFonts w:eastAsia="Calibri" w:cs=""/>
+                <w:kern w:val="0"/>
+                <w:sz w:val="22"/>
+                <w:szCs w:val="22"/>
+                <w:lang w:val="en-US" w:eastAsia="en-US" w:bidi="ar-SA"/>
+              </w:rPr>
+              <w:t>7:00 pm</w:t>
+            </w:r>
+          </w:p>
+        </w:tc>
+        <w:tc>
+          <w:tcPr>
+            <w:tcW w:w="1632" w:type="dxa"/>
+            <w:tcBorders>
+              <w:top w:val="nil"/>
+            </w:tcBorders>
+          </w:tcPr>
+          <w:p>
+            <w:pPr>
+              <w:pStyle w:val="Normal"/>
+              <w:widowControl/>
+              <w:suppressAutoHyphens w:val="true"/>
+              <w:spacing w:lineRule="auto" w:line="240" w:before="0" w:after="0"/>
+              <w:jc w:val="left"/>
+              <w:rPr>
+                <w:rFonts w:ascii="Calibri" w:hAnsi="Calibri" w:eastAsia="Calibri" w:cs=""/>
+                <w:kern w:val="0"/>
+                <w:sz w:val="22"/>
+                <w:szCs w:val="22"/>
+                <w:lang w:val="en-US" w:eastAsia="en-US" w:bidi="ar-SA"/>
+              </w:rPr>
+            </w:pPr>
+            <w:r>
+              <w:rPr>
+                <w:rFonts w:eastAsia="Calibri" w:cs=""/>
+                <w:kern w:val="0"/>
+                <w:sz w:val="22"/>
+                <w:szCs w:val="22"/>
+                <w:lang w:val="en-US" w:eastAsia="en-US" w:bidi="ar-SA"/>
+              </w:rPr>
+              <w:t>10:00 pm</w:t>
+            </w:r>
+          </w:p>
+        </w:tc>
+        <w:tc>
+          <w:tcPr>
+            <w:tcW w:w="1514" w:type="dxa"/>
+            <w:tcBorders>
+              <w:top w:val="nil"/>
+            </w:tcBorders>
+          </w:tcPr>
+          <w:p>
+            <w:pPr>
+              <w:pStyle w:val="Normal"/>
+              <w:widowControl/>
+              <w:suppressAutoHyphens w:val="true"/>
+              <w:spacing w:lineRule="auto" w:line="240" w:before="0" w:after="0"/>
+              <w:jc w:val="left"/>
+              <w:rPr>
+                <w:rFonts w:ascii="Calibri" w:hAnsi="Calibri" w:eastAsia="Calibri" w:cs=""/>
+                <w:kern w:val="0"/>
+                <w:sz w:val="22"/>
+                <w:szCs w:val="22"/>
+                <w:lang w:val="en-US" w:eastAsia="en-US" w:bidi="ar-SA"/>
+              </w:rPr>
+            </w:pPr>
+            <w:r>
+              <w:rPr>
+                <w:rFonts w:eastAsia="Calibri" w:cs=""/>
+                <w:kern w:val="0"/>
+                <w:sz w:val="22"/>
+                <w:szCs w:val="22"/>
+                <w:lang w:val="en-US" w:eastAsia="en-US" w:bidi="ar-SA"/>
+              </w:rPr>
+              <w:t>180 min</w:t>
+            </w:r>
+          </w:p>
+        </w:tc>
+      </w:tr>
+      <w:tr>
+        <w:trPr>
+          <w:trHeight w:val="231" w:hRule="atLeast"/>
+        </w:trPr>
+        <w:tc>
+          <w:tcPr>
+            <w:tcW w:w="1819" w:type="dxa"/>
+            <w:tcBorders>
+              <w:top w:val="nil"/>
+            </w:tcBorders>
+          </w:tcPr>
+          <w:p>
+            <w:pPr>
+              <w:pStyle w:val="Normal"/>
+              <w:widowControl/>
+              <w:suppressAutoHyphens w:val="true"/>
+              <w:spacing w:lineRule="auto" w:line="240" w:before="0" w:after="0"/>
+              <w:jc w:val="left"/>
+              <w:rPr>
+                <w:rFonts w:ascii="Calibri" w:hAnsi="Calibri" w:eastAsia="Calibri" w:cs=""/>
+                <w:kern w:val="0"/>
+                <w:sz w:val="22"/>
+                <w:szCs w:val="22"/>
+                <w:lang w:val="en-US" w:eastAsia="en-US" w:bidi="ar-SA"/>
+              </w:rPr>
+            </w:pPr>
+            <w:r>
+              <w:rPr>
+                <w:rFonts w:eastAsia="Calibri" w:cs=""/>
+                <w:kern w:val="0"/>
+                <w:sz w:val="22"/>
+                <w:szCs w:val="22"/>
+                <w:lang w:val="en-US" w:eastAsia="en-US" w:bidi="ar-SA"/>
+              </w:rPr>
+            </w:r>
+          </w:p>
+        </w:tc>
+        <w:tc>
+          <w:tcPr>
+            <w:tcW w:w="1772" w:type="dxa"/>
+            <w:tcBorders>
+              <w:top w:val="nil"/>
+            </w:tcBorders>
+          </w:tcPr>
+          <w:p>
+            <w:pPr>
+              <w:pStyle w:val="Normal"/>
+              <w:widowControl/>
+              <w:suppressAutoHyphens w:val="true"/>
+              <w:spacing w:lineRule="auto" w:line="240" w:before="0" w:after="0"/>
+              <w:jc w:val="left"/>
+              <w:rPr>
+                <w:rFonts w:ascii="Calibri" w:hAnsi="Calibri" w:eastAsia="Calibri" w:cs=""/>
+                <w:kern w:val="0"/>
+                <w:sz w:val="22"/>
+                <w:szCs w:val="22"/>
+                <w:lang w:val="en-US" w:eastAsia="en-US" w:bidi="ar-SA"/>
+              </w:rPr>
+            </w:pPr>
+            <w:r>
+              <w:rPr>
+                <w:rFonts w:eastAsia="Calibri" w:cs=""/>
+                <w:kern w:val="0"/>
+                <w:sz w:val="22"/>
+                <w:szCs w:val="22"/>
+                <w:lang w:val="en-US" w:eastAsia="en-US" w:bidi="ar-SA"/>
+              </w:rPr>
+              <w:t>Reviewed Teammates’ Work</w:t>
+            </w:r>
+          </w:p>
+        </w:tc>
+        <w:tc>
+          <w:tcPr>
+            <w:tcW w:w="1323" w:type="dxa"/>
+            <w:tcBorders>
+              <w:top w:val="nil"/>
+            </w:tcBorders>
+          </w:tcPr>
+          <w:p>
+            <w:pPr>
+              <w:pStyle w:val="Normal"/>
+              <w:widowControl/>
+              <w:suppressAutoHyphens w:val="true"/>
+              <w:spacing w:lineRule="auto" w:line="240" w:before="0" w:after="0"/>
+              <w:jc w:val="left"/>
+              <w:rPr>
+                <w:rFonts w:ascii="Calibri" w:hAnsi="Calibri" w:eastAsia="Calibri" w:cs=""/>
+                <w:kern w:val="0"/>
+                <w:sz w:val="22"/>
+                <w:szCs w:val="22"/>
+                <w:lang w:val="en-US" w:eastAsia="en-US" w:bidi="ar-SA"/>
+              </w:rPr>
+            </w:pPr>
+            <w:r>
+              <w:rPr>
+                <w:sz w:val="22"/>
+              </w:rPr>
+              <w:t>10/1</w:t>
+            </w:r>
+            <w:r>
+              <w:rPr>
+                <w:sz w:val="22"/>
+              </w:rPr>
+              <w:t>8</w:t>
+            </w:r>
+            <w:r>
+              <w:rPr>
+                <w:sz w:val="22"/>
+              </w:rPr>
+              <w:t>/26</w:t>
+            </w:r>
+          </w:p>
+        </w:tc>
+        <w:tc>
+          <w:tcPr>
+            <w:tcW w:w="1516" w:type="dxa"/>
+            <w:tcBorders>
+              <w:top w:val="nil"/>
+            </w:tcBorders>
+          </w:tcPr>
+          <w:p>
+            <w:pPr>
+              <w:pStyle w:val="Normal"/>
+              <w:widowControl/>
+              <w:suppressAutoHyphens w:val="true"/>
+              <w:spacing w:lineRule="auto" w:line="240" w:before="0" w:after="0"/>
+              <w:jc w:val="left"/>
+              <w:rPr>
+                <w:rFonts w:ascii="Calibri" w:hAnsi="Calibri" w:eastAsia="Calibri" w:cs=""/>
+                <w:kern w:val="0"/>
+                <w:sz w:val="22"/>
+                <w:szCs w:val="22"/>
+                <w:lang w:val="en-US" w:eastAsia="en-US" w:bidi="ar-SA"/>
+              </w:rPr>
+            </w:pPr>
+            <w:r>
+              <w:rPr>
+                <w:rFonts w:eastAsia="Calibri" w:cs=""/>
+                <w:kern w:val="0"/>
+                <w:sz w:val="22"/>
+                <w:szCs w:val="22"/>
+                <w:lang w:val="en-US" w:eastAsia="en-US" w:bidi="ar-SA"/>
+              </w:rPr>
+              <w:t>12:00 am</w:t>
+            </w:r>
+          </w:p>
+        </w:tc>
+        <w:tc>
+          <w:tcPr>
+            <w:tcW w:w="1632" w:type="dxa"/>
+            <w:tcBorders>
+              <w:top w:val="nil"/>
+            </w:tcBorders>
+          </w:tcPr>
+          <w:p>
+            <w:pPr>
+              <w:pStyle w:val="Normal"/>
+              <w:widowControl/>
+              <w:suppressAutoHyphens w:val="true"/>
+              <w:spacing w:lineRule="auto" w:line="240" w:before="0" w:after="0"/>
+              <w:jc w:val="left"/>
+              <w:rPr>
+                <w:rFonts w:ascii="Calibri" w:hAnsi="Calibri" w:eastAsia="Calibri" w:cs=""/>
+                <w:kern w:val="0"/>
+                <w:sz w:val="22"/>
+                <w:szCs w:val="22"/>
+                <w:lang w:val="en-US" w:eastAsia="en-US" w:bidi="ar-SA"/>
+              </w:rPr>
+            </w:pPr>
+            <w:r>
+              <w:rPr>
+                <w:rFonts w:eastAsia="Calibri" w:cs=""/>
+                <w:kern w:val="0"/>
+                <w:sz w:val="22"/>
+                <w:szCs w:val="22"/>
+                <w:lang w:val="en-US" w:eastAsia="en-US" w:bidi="ar-SA"/>
+              </w:rPr>
+              <w:t>2:00 pm</w:t>
+            </w:r>
+          </w:p>
+        </w:tc>
+        <w:tc>
+          <w:tcPr>
+            <w:tcW w:w="1514" w:type="dxa"/>
+            <w:tcBorders>
+              <w:top w:val="nil"/>
+            </w:tcBorders>
+          </w:tcPr>
+          <w:p>
+            <w:pPr>
+              <w:pStyle w:val="Normal"/>
+              <w:widowControl/>
+              <w:suppressAutoHyphens w:val="true"/>
+              <w:spacing w:lineRule="auto" w:line="240" w:before="0" w:after="0"/>
+              <w:jc w:val="left"/>
+              <w:rPr>
+                <w:rFonts w:ascii="Calibri" w:hAnsi="Calibri" w:eastAsia="Calibri" w:cs=""/>
+                <w:kern w:val="0"/>
+                <w:sz w:val="22"/>
+                <w:szCs w:val="22"/>
+                <w:lang w:val="en-US" w:eastAsia="en-US" w:bidi="ar-SA"/>
+              </w:rPr>
+            </w:pPr>
+            <w:r>
+              <w:rPr>
+                <w:rFonts w:eastAsia="Calibri" w:cs=""/>
+                <w:kern w:val="0"/>
+                <w:sz w:val="22"/>
+                <w:szCs w:val="22"/>
+                <w:lang w:val="en-US" w:eastAsia="en-US" w:bidi="ar-SA"/>
+              </w:rPr>
+              <w:t>120 min</w:t>
+            </w:r>
+          </w:p>
+        </w:tc>
+      </w:tr>
+      <w:tr>
+        <w:trPr>
+          <w:trHeight w:val="231" w:hRule="atLeast"/>
+        </w:trPr>
+        <w:tc>
+          <w:tcPr>
+            <w:tcW w:w="1819" w:type="dxa"/>
+            <w:tcBorders>
+              <w:top w:val="nil"/>
+            </w:tcBorders>
+          </w:tcPr>
+          <w:p>
+            <w:pPr>
+              <w:pStyle w:val="Normal"/>
+              <w:widowControl/>
+              <w:suppressAutoHyphens w:val="true"/>
+              <w:spacing w:lineRule="auto" w:line="240" w:before="0" w:after="0"/>
+              <w:jc w:val="left"/>
+              <w:rPr>
+                <w:rFonts w:ascii="Calibri" w:hAnsi="Calibri" w:eastAsia="Calibri" w:cs=""/>
+                <w:kern w:val="0"/>
+                <w:sz w:val="22"/>
+                <w:szCs w:val="22"/>
+                <w:lang w:val="en-US" w:eastAsia="en-US" w:bidi="ar-SA"/>
+              </w:rPr>
+            </w:pPr>
+            <w:r>
+              <w:rPr>
+                <w:rFonts w:eastAsia="Calibri" w:cs=""/>
+                <w:kern w:val="0"/>
+                <w:sz w:val="22"/>
+                <w:szCs w:val="22"/>
+                <w:lang w:val="en-US" w:eastAsia="en-US" w:bidi="ar-SA"/>
+              </w:rPr>
+            </w:r>
+          </w:p>
+        </w:tc>
+        <w:tc>
+          <w:tcPr>
+            <w:tcW w:w="1772" w:type="dxa"/>
+            <w:tcBorders>
+              <w:top w:val="nil"/>
+            </w:tcBorders>
+          </w:tcPr>
+          <w:p>
+            <w:pPr>
+              <w:pStyle w:val="Normal"/>
+              <w:widowControl/>
+              <w:suppressAutoHyphens w:val="true"/>
+              <w:spacing w:lineRule="auto" w:line="240" w:before="0" w:after="0"/>
+              <w:jc w:val="left"/>
+              <w:rPr>
+                <w:rFonts w:ascii="Calibri" w:hAnsi="Calibri" w:eastAsia="Calibri" w:cs=""/>
+                <w:kern w:val="0"/>
+                <w:sz w:val="22"/>
+                <w:szCs w:val="22"/>
+                <w:lang w:val="en-US" w:eastAsia="en-US" w:bidi="ar-SA"/>
+              </w:rPr>
+            </w:pPr>
+            <w:r>
+              <w:rPr>
+                <w:rFonts w:eastAsia="Calibri" w:cs=""/>
+                <w:kern w:val="0"/>
+                <w:sz w:val="22"/>
+                <w:szCs w:val="22"/>
+                <w:lang w:val="en-US" w:eastAsia="en-US" w:bidi="ar-SA"/>
+              </w:rPr>
+            </w:r>
+          </w:p>
+        </w:tc>
+        <w:tc>
+          <w:tcPr>
+            <w:tcW w:w="1323" w:type="dxa"/>
+            <w:tcBorders>
+              <w:top w:val="nil"/>
+            </w:tcBorders>
+          </w:tcPr>
+          <w:p>
+            <w:pPr>
+              <w:pStyle w:val="Normal"/>
+              <w:widowControl/>
+              <w:suppressAutoHyphens w:val="true"/>
+              <w:spacing w:lineRule="auto" w:line="240" w:before="0" w:after="0"/>
+              <w:jc w:val="left"/>
+              <w:rPr>
+                <w:rFonts w:ascii="Calibri" w:hAnsi="Calibri" w:eastAsia="Calibri" w:cs=""/>
+                <w:kern w:val="0"/>
+                <w:sz w:val="22"/>
+                <w:szCs w:val="22"/>
+                <w:lang w:val="en-US" w:eastAsia="en-US" w:bidi="ar-SA"/>
+              </w:rPr>
+            </w:pPr>
+            <w:r>
+              <w:rPr>
+                <w:rFonts w:eastAsia="Calibri" w:cs=""/>
+                <w:kern w:val="0"/>
+                <w:sz w:val="22"/>
+                <w:szCs w:val="22"/>
+                <w:lang w:val="en-US" w:eastAsia="en-US" w:bidi="ar-SA"/>
+              </w:rPr>
+            </w:r>
+          </w:p>
+        </w:tc>
+        <w:tc>
+          <w:tcPr>
+            <w:tcW w:w="1516" w:type="dxa"/>
+            <w:tcBorders>
+              <w:top w:val="nil"/>
+            </w:tcBorders>
+          </w:tcPr>
+          <w:p>
+            <w:pPr>
+              <w:pStyle w:val="Normal"/>
+              <w:widowControl/>
+              <w:suppressAutoHyphens w:val="true"/>
+              <w:spacing w:lineRule="auto" w:line="240" w:before="0" w:after="0"/>
+              <w:jc w:val="left"/>
+              <w:rPr>
+                <w:rFonts w:ascii="Calibri" w:hAnsi="Calibri" w:eastAsia="Calibri" w:cs=""/>
+                <w:kern w:val="0"/>
+                <w:sz w:val="22"/>
+                <w:szCs w:val="22"/>
+                <w:lang w:val="en-US" w:eastAsia="en-US" w:bidi="ar-SA"/>
+              </w:rPr>
+            </w:pPr>
+            <w:r>
+              <w:rPr>
+                <w:rFonts w:eastAsia="Calibri" w:cs=""/>
+                <w:kern w:val="0"/>
+                <w:sz w:val="22"/>
+                <w:szCs w:val="22"/>
+                <w:lang w:val="en-US" w:eastAsia="en-US" w:bidi="ar-SA"/>
+              </w:rPr>
+            </w:r>
+          </w:p>
+        </w:tc>
+        <w:tc>
+          <w:tcPr>
+            <w:tcW w:w="1632" w:type="dxa"/>
+            <w:tcBorders>
+              <w:top w:val="nil"/>
+            </w:tcBorders>
+          </w:tcPr>
+          <w:p>
+            <w:pPr>
+              <w:pStyle w:val="Normal"/>
+              <w:widowControl/>
+              <w:suppressAutoHyphens w:val="true"/>
+              <w:spacing w:lineRule="auto" w:line="240" w:before="0" w:after="0"/>
+              <w:jc w:val="left"/>
+              <w:rPr>
+                <w:rFonts w:ascii="Calibri" w:hAnsi="Calibri" w:eastAsia="Calibri" w:cs=""/>
+                <w:kern w:val="0"/>
+                <w:sz w:val="22"/>
+                <w:szCs w:val="22"/>
+                <w:lang w:val="en-US" w:eastAsia="en-US" w:bidi="ar-SA"/>
+              </w:rPr>
+            </w:pPr>
+            <w:r>
+              <w:rPr>
+                <w:rFonts w:eastAsia="Calibri" w:cs=""/>
+                <w:kern w:val="0"/>
+                <w:sz w:val="22"/>
+                <w:szCs w:val="22"/>
+                <w:lang w:val="en-US" w:eastAsia="en-US" w:bidi="ar-SA"/>
+              </w:rPr>
+            </w:r>
+          </w:p>
+        </w:tc>
+        <w:tc>
+          <w:tcPr>
+            <w:tcW w:w="1514" w:type="dxa"/>
+            <w:tcBorders>
+              <w:top w:val="nil"/>
+            </w:tcBorders>
+          </w:tcPr>
+          <w:p>
+            <w:pPr>
+              <w:pStyle w:val="Normal"/>
+              <w:widowControl/>
+              <w:suppressAutoHyphens w:val="true"/>
+              <w:spacing w:lineRule="auto" w:line="240" w:before="0" w:after="0"/>
+              <w:jc w:val="left"/>
+              <w:rPr>
+                <w:rFonts w:ascii="Calibri" w:hAnsi="Calibri" w:eastAsia="Calibri" w:cs=""/>
+                <w:kern w:val="0"/>
+                <w:sz w:val="22"/>
+                <w:szCs w:val="22"/>
+                <w:lang w:val="en-US" w:eastAsia="en-US" w:bidi="ar-SA"/>
+              </w:rPr>
+            </w:pPr>
+            <w:r>
+              <w:rPr>
+                <w:sz w:val="22"/>
+              </w:rPr>
               <w:t xml:space="preserve">Week total: </w:t>
             </w:r>
             <w:r>
               <w:rPr>
                 <w:sz w:val="22"/>
               </w:rPr>
-              <w:t>90</w:t>
-            </w:r>
-            <w:r>
-              <w:rPr>
-                <w:sz w:val="22"/>
-              </w:rPr>
-              <w:t xml:space="preserve"> min</w:t>
+              <w:t>420 min</w:t>
             </w:r>
           </w:p>
         </w:tc>
@@ -4324,6 +5109,29 @@
       <w:rFonts w:cs="Arial"/>
     </w:rPr>
   </w:style>
+  <w:style w:type="paragraph" w:styleId="Style16">
+    <w:name w:val="Вміст таблиці"/>
+    <w:basedOn w:val="Normal"/>
+    <w:qFormat/>
+    <w:pPr>
+      <w:widowControl w:val="false"/>
+      <w:suppressLineNumbers/>
+    </w:pPr>
+    <w:rPr/>
+  </w:style>
+  <w:style w:type="paragraph" w:styleId="Style17">
+    <w:name w:val="Заголовок таблиці"/>
+    <w:basedOn w:val="Style16"/>
+    <w:qFormat/>
+    <w:pPr>
+      <w:suppressLineNumbers/>
+      <w:jc w:val="center"/>
+    </w:pPr>
+    <w:rPr>
+      <w:b/>
+      <w:bCs/>
+    </w:rPr>
+  </w:style>
   <w:style w:type="paragraph" w:styleId="user2">
     <w:name w:val="Вміст таблиці (user)"/>
     <w:basedOn w:val="Normal"/>
@@ -4347,31 +5155,8 @@
       <w:bCs/>
     </w:rPr>
   </w:style>
-  <w:style w:type="paragraph" w:styleId="Style16">
-    <w:name w:val="Вміст таблиці"/>
-    <w:basedOn w:val="Normal"/>
-    <w:qFormat/>
-    <w:pPr>
-      <w:widowControl w:val="false"/>
-      <w:suppressLineNumbers/>
-    </w:pPr>
-    <w:rPr/>
-  </w:style>
-  <w:style w:type="paragraph" w:styleId="Style17">
-    <w:name w:val="Заголовок таблиці"/>
-    <w:basedOn w:val="Style16"/>
-    <w:qFormat/>
-    <w:pPr>
-      <w:suppressLineNumbers/>
-      <w:jc w:val="center"/>
-    </w:pPr>
-    <w:rPr>
-      <w:b/>
-      <w:bCs/>
-    </w:rPr>
-  </w:style>
-  <w:style w:type="numbering" w:styleId="user4" w:default="1">
-    <w:name w:val="Без маркерів (user)"/>
+  <w:style w:type="numbering" w:styleId="Style18" w:default="1">
+    <w:name w:val="Без маркерів"/>
     <w:uiPriority w:val="99"/>
     <w:semiHidden/>
     <w:unhideWhenUsed/>

</xml_diff>